<commit_message>
🤖 DOCS: Cover + TOC + Content aligned
</commit_message>
<xml_diff>
--- a/cpi-artifacts/EmailreceiverxlsxToXML/CPI-Mail-Reader_3/src/main/resources/scenarioflows/integrationflow/integrationflow_Technical_Specification.docx
+++ b/cpi-artifacts/EmailreceiverxlsxToXML/CPI-Mail-Reader_3/src/main/resources/scenarioflows/integrationflow/integrationflow_Technical_Specification.docx
@@ -2,73 +2,81 @@
 <file path=word/document.xml><?xml version="1.0" encoding="utf-8"?>
 <w:document xmlns:w="http://schemas.openxmlformats.org/wordprocessingml/2006/main" xmlns:m="http://schemas.openxmlformats.org/officeDocument/2006/math" xmlns:r="http://schemas.openxmlformats.org/officeDocument/2006/relationships" xmlns:o="urn:schemas-microsoft-com:office:office" xmlns:v="urn:schemas-microsoft-com:vml" xmlns:w10="urn:schemas-microsoft-com:office:word" xmlns:a="http://schemas.openxmlformats.org/drawingml/2006/main" xmlns:pic="http://schemas.openxmlformats.org/drawingml/2006/picture" xmlns:wp="http://schemas.openxmlformats.org/drawingml/2006/wordprocessingDrawing">
   <w:body>
-    <w:bookmarkStart w:id="31" w:name="documentation-for-iflow-integrationflow"/>
     <w:p>
       <w:pPr>
-        <w:pStyle w:val="Heading1"/>
-      </w:pPr>
-      <w:r>
-        <w:t xml:space="preserve">Documentation for iFlow:</w:t>
-      </w:r>
-      <w:r>
-        <w:t xml:space="preserve"> </w:t>
-      </w:r>
-      <w:r>
-        <w:rPr>
-          <w:rStyle w:val="VerbatimChar"/>
-        </w:rPr>
+        <w:pStyle w:val="FirstParagraph"/>
+      </w:pPr>
+      <w:r>
         <w:t xml:space="preserve">integrationflow</w:t>
-      </w:r>
-    </w:p>
-    <w:bookmarkStart w:id="20" w:name="overview"/>
-    <w:p>
-      <w:pPr>
-        <w:pStyle w:val="Heading2"/>
-      </w:pPr>
-      <w:r>
-        <w:t xml:space="preserve">Overview</w:t>
       </w:r>
     </w:p>
     <w:p>
       <w:pPr>
-        <w:pStyle w:val="FirstParagraph"/>
-      </w:pPr>
-      <w:r>
-        <w:t xml:space="preserve">The</w:t>
-      </w:r>
-      <w:r>
-        <w:t xml:space="preserve"> </w:t>
-      </w:r>
-      <w:r>
-        <w:rPr>
-          <w:rStyle w:val="VerbatimChar"/>
-        </w:rPr>
-        <w:t xml:space="preserve">integrationflow</w:t>
-      </w:r>
-      <w:r>
-        <w:t xml:space="preserve"> </w:t>
-      </w:r>
-      <w:r>
-        <w:t xml:space="preserve">is an integration flow designed to facilitate the transfer of data between a sender and a receiver using email protocols (IMAP for receiving and SMTP for sending). The flow is structured to read emails from a specified mailbox, process the content, and send the processed data to a designated recipient.</w:t>
+        <w:pStyle w:val="BodyText"/>
+      </w:pPr>
+      <w:r>
+        <w:t xml:space="preserve">Technical Specification Document</w:t>
       </w:r>
     </w:p>
-    <w:bookmarkEnd w:id="20"/>
-    <w:bookmarkStart w:id="27" w:name="iflow-structure"/>
     <w:p>
       <w:pPr>
-        <w:pStyle w:val="Heading2"/>
-      </w:pPr>
-      <w:r>
-        <w:t xml:space="preserve">iFlow Structure</w:t>
-      </w:r>
+        <w:pStyle w:val="BodyText"/>
+      </w:pPr>
     </w:p>
-    <w:bookmarkStart w:id="21" w:name="collaboration"/>
     <w:p>
       <w:pPr>
-        <w:pStyle w:val="Heading3"/>
-      </w:pPr>
-      <w:r>
-        <w:t xml:space="preserve">Collaboration</w:t>
+        <w:pStyle w:val="BodyText"/>
+      </w:pPr>
+      <w:r>
+        <w:t xml:space="preserve">Author</w:t>
+      </w:r>
+    </w:p>
+    <w:p>
+      <w:pPr>
+        <w:pStyle w:val="BodyText"/>
+      </w:pPr>
+      <w:r>
+        <w:t xml:space="preserve">Sindhu</w:t>
+      </w:r>
+    </w:p>
+    <w:p>
+      <w:pPr>
+        <w:pStyle w:val="BodyText"/>
+      </w:pPr>
+      <w:r>
+        <w:t xml:space="preserve">Date</w:t>
+      </w:r>
+    </w:p>
+    <w:p>
+      <w:pPr>
+        <w:pStyle w:val="BodyText"/>
+      </w:pPr>
+      <w:r>
+        <w:t xml:space="preserve">2026-01-05</w:t>
+      </w:r>
+    </w:p>
+    <w:p>
+      <w:pPr>
+        <w:pStyle w:val="BodyText"/>
+      </w:pPr>
+      <w:r>
+        <w:t xml:space="preserve">Version</w:t>
+      </w:r>
+    </w:p>
+    <w:p>
+      <w:pPr>
+        <w:pStyle w:val="BodyText"/>
+      </w:pPr>
+      <w:r>
+        <w:t xml:space="preserve">1.0.0</w:t>
+      </w:r>
+    </w:p>
+    <w:p>
+      <w:pPr>
+        <w:pStyle w:val="BodyText"/>
+      </w:pPr>
+      <w:r>
+        <w:t xml:space="preserve">Table of Contents</w:t>
       </w:r>
     </w:p>
     <w:p>
@@ -77,6 +85,188 @@
           <w:ilvl w:val="0"/>
           <w:numId w:val="1001"/>
         </w:numPr>
+      </w:pPr>
+      <w:r>
+        <w:t xml:space="preserve">Introduction</w:t>
+      </w:r>
+      <w:r>
+        <w:t xml:space="preserve"> </w:t>
+      </w:r>
+      <w:r>
+        <w:t xml:space="preserve">1.1 Purpose</w:t>
+      </w:r>
+      <w:r>
+        <w:t xml:space="preserve"> </w:t>
+      </w:r>
+      <w:r>
+        <w:t xml:space="preserve">1.2 Scope</w:t>
+      </w:r>
+    </w:p>
+    <w:p>
+      <w:pPr>
+        <w:numPr>
+          <w:ilvl w:val="0"/>
+          <w:numId w:val="1001"/>
+        </w:numPr>
+      </w:pPr>
+      <w:r>
+        <w:t xml:space="preserve">Integration Overview</w:t>
+      </w:r>
+      <w:r>
+        <w:t xml:space="preserve"> </w:t>
+      </w:r>
+      <w:r>
+        <w:t xml:space="preserve">2.1 Integration Architecture</w:t>
+      </w:r>
+      <w:r>
+        <w:t xml:space="preserve"> </w:t>
+      </w:r>
+      <w:r>
+        <w:t xml:space="preserve">2.2 Integration Components</w:t>
+      </w:r>
+    </w:p>
+    <w:p>
+      <w:pPr>
+        <w:numPr>
+          <w:ilvl w:val="0"/>
+          <w:numId w:val="1001"/>
+        </w:numPr>
+      </w:pPr>
+      <w:r>
+        <w:t xml:space="preserve">Integration Scenarios</w:t>
+      </w:r>
+      <w:r>
+        <w:t xml:space="preserve"> </w:t>
+      </w:r>
+      <w:r>
+        <w:t xml:space="preserve">3.1 Scenario Description</w:t>
+      </w:r>
+      <w:r>
+        <w:t xml:space="preserve"> </w:t>
+      </w:r>
+      <w:r>
+        <w:t xml:space="preserve">3.2 Data Flows</w:t>
+      </w:r>
+      <w:r>
+        <w:t xml:space="preserve"> </w:t>
+      </w:r>
+      <w:r>
+        <w:t xml:space="preserve">3.3 Security Requirements</w:t>
+      </w:r>
+    </w:p>
+    <w:p>
+      <w:pPr>
+        <w:numPr>
+          <w:ilvl w:val="0"/>
+          <w:numId w:val="1001"/>
+        </w:numPr>
+      </w:pPr>
+      <w:r>
+        <w:t xml:space="preserve">Error Handling and Logging</w:t>
+      </w:r>
+    </w:p>
+    <w:p>
+      <w:pPr>
+        <w:numPr>
+          <w:ilvl w:val="0"/>
+          <w:numId w:val="1001"/>
+        </w:numPr>
+      </w:pPr>
+      <w:r>
+        <w:t xml:space="preserve">Testing Validation</w:t>
+      </w:r>
+    </w:p>
+    <w:p>
+      <w:pPr>
+        <w:numPr>
+          <w:ilvl w:val="0"/>
+          <w:numId w:val="1001"/>
+        </w:numPr>
+      </w:pPr>
+      <w:r>
+        <w:t xml:space="preserve">Reference Documents</w:t>
+      </w:r>
+    </w:p>
+    <w:bookmarkStart w:id="41" w:name="documentation-for-iflow-integrationflow"/>
+    <w:p>
+      <w:pPr>
+        <w:pStyle w:val="Heading1"/>
+      </w:pPr>
+      <w:r>
+        <w:t xml:space="preserve">Documentation for iFlow</w:t>
+      </w:r>
+      <w:r>
+        <w:t xml:space="preserve"> </w:t>
+      </w:r>
+      <w:r>
+        <w:t xml:space="preserve">‘</w:t>
+      </w:r>
+      <w:r>
+        <w:t xml:space="preserve">integrationflow</w:t>
+      </w:r>
+      <w:r>
+        <w:t xml:space="preserve">’</w:t>
+      </w:r>
+    </w:p>
+    <w:bookmarkStart w:id="20" w:name="overview"/>
+    <w:p>
+      <w:pPr>
+        <w:pStyle w:val="Heading2"/>
+      </w:pPr>
+      <w:r>
+        <w:t xml:space="preserve">1. Overview</w:t>
+      </w:r>
+    </w:p>
+    <w:p>
+      <w:pPr>
+        <w:pStyle w:val="FirstParagraph"/>
+      </w:pPr>
+      <w:r>
+        <w:t xml:space="preserve">The iFlow</w:t>
+      </w:r>
+      <w:r>
+        <w:t xml:space="preserve"> </w:t>
+      </w:r>
+      <w:r>
+        <w:t xml:space="preserve">‘</w:t>
+      </w:r>
+      <w:r>
+        <w:t xml:space="preserve">integrationflow</w:t>
+      </w:r>
+      <w:r>
+        <w:t xml:space="preserve">’</w:t>
+      </w:r>
+      <w:r>
+        <w:t xml:space="preserve"> </w:t>
+      </w:r>
+      <w:r>
+        <w:t xml:space="preserve">is designed to facilitate the integration of email communication using IMAP and SMTP protocols. It retrieves unread emails from a Gmail account and forwards the content as an attachment to a specified recipient. The iFlow consists of multiple components including a start event, call activities for processing, and message flows for communication between the sender and receiver.</w:t>
+      </w:r>
+    </w:p>
+    <w:bookmarkEnd w:id="20"/>
+    <w:bookmarkStart w:id="21" w:name="iflow-structure"/>
+    <w:p>
+      <w:pPr>
+        <w:pStyle w:val="Heading2"/>
+      </w:pPr>
+      <w:r>
+        <w:t xml:space="preserve">2. iFlow Structure</w:t>
+      </w:r>
+    </w:p>
+    <w:p>
+      <w:pPr>
+        <w:pStyle w:val="FirstParagraph"/>
+      </w:pPr>
+      <w:r>
+        <w:t xml:space="preserve">The iFlow is structured as follows:</w:t>
+      </w:r>
+    </w:p>
+    <w:p>
+      <w:pPr>
+        <w:numPr>
+          <w:ilvl w:val="0"/>
+          <w:numId w:val="1002"/>
+        </w:numPr>
         <w:pStyle w:val="Compact"/>
       </w:pPr>
       <w:r>
@@ -84,26 +274,17 @@
           <w:bCs/>
           <w:b/>
         </w:rPr>
-        <w:t xml:space="preserve">Collaboration ID</w:t>
-      </w:r>
-      <w:r>
-        <w:t xml:space="preserve">:</w:t>
-      </w:r>
-      <w:r>
-        <w:t xml:space="preserve"> </w:t>
-      </w:r>
-      <w:r>
-        <w:rPr>
-          <w:rStyle w:val="VerbatimChar"/>
-        </w:rPr>
-        <w:t xml:space="preserve">Collaboration_1</w:t>
+        <w:t xml:space="preserve">Start Event</w:t>
+      </w:r>
+      <w:r>
+        <w:t xml:space="preserve">: Initiates the flow.</w:t>
       </w:r>
     </w:p>
     <w:p>
       <w:pPr>
         <w:numPr>
           <w:ilvl w:val="0"/>
-          <w:numId w:val="1001"/>
+          <w:numId w:val="1002"/>
         </w:numPr>
         <w:pStyle w:val="Compact"/>
       </w:pPr>
@@ -112,7 +293,7 @@
           <w:bCs/>
           <w:b/>
         </w:rPr>
-        <w:t xml:space="preserve">Participants</w:t>
+        <w:t xml:space="preserve">Call Activities</w:t>
       </w:r>
       <w:r>
         <w:t xml:space="preserve">:</w:t>
@@ -122,7 +303,111 @@
       <w:pPr>
         <w:numPr>
           <w:ilvl w:val="1"/>
+          <w:numId w:val="1003"/>
+        </w:numPr>
+        <w:pStyle w:val="Compact"/>
+      </w:pPr>
+      <w:r>
+        <w:t xml:space="preserve">Groovy Script for processing.</w:t>
+      </w:r>
+    </w:p>
+    <w:p>
+      <w:pPr>
+        <w:numPr>
+          <w:ilvl w:val="1"/>
+          <w:numId w:val="1003"/>
+        </w:numPr>
+        <w:pStyle w:val="Compact"/>
+      </w:pPr>
+      <w:r>
+        <w:t xml:space="preserve">Content Modifiers for enriching the message.</w:t>
+      </w:r>
+    </w:p>
+    <w:p>
+      <w:pPr>
+        <w:numPr>
+          <w:ilvl w:val="0"/>
           <w:numId w:val="1002"/>
+        </w:numPr>
+        <w:pStyle w:val="Compact"/>
+      </w:pPr>
+      <w:r>
+        <w:rPr>
+          <w:bCs/>
+          <w:b/>
+        </w:rPr>
+        <w:t xml:space="preserve">End Event</w:t>
+      </w:r>
+      <w:r>
+        <w:t xml:space="preserve">: Marks the completion of the flow.</w:t>
+      </w:r>
+    </w:p>
+    <w:p>
+      <w:pPr>
+        <w:numPr>
+          <w:ilvl w:val="0"/>
+          <w:numId w:val="1002"/>
+        </w:numPr>
+        <w:pStyle w:val="Compact"/>
+      </w:pPr>
+      <w:r>
+        <w:rPr>
+          <w:bCs/>
+          <w:b/>
+        </w:rPr>
+        <w:t xml:space="preserve">Message Flows</w:t>
+      </w:r>
+      <w:r>
+        <w:t xml:space="preserve">:</w:t>
+      </w:r>
+    </w:p>
+    <w:p>
+      <w:pPr>
+        <w:numPr>
+          <w:ilvl w:val="1"/>
+          <w:numId w:val="1004"/>
+        </w:numPr>
+        <w:pStyle w:val="Compact"/>
+      </w:pPr>
+      <w:r>
+        <w:t xml:space="preserve">From the sender (IMAP) to the start event.</w:t>
+      </w:r>
+    </w:p>
+    <w:p>
+      <w:pPr>
+        <w:numPr>
+          <w:ilvl w:val="1"/>
+          <w:numId w:val="1004"/>
+        </w:numPr>
+        <w:pStyle w:val="Compact"/>
+      </w:pPr>
+      <w:r>
+        <w:t xml:space="preserve">From the end event to the receiver (SMTP).</w:t>
+      </w:r>
+    </w:p>
+    <w:bookmarkEnd w:id="21"/>
+    <w:bookmarkStart w:id="22" w:name="participants"/>
+    <w:p>
+      <w:pPr>
+        <w:pStyle w:val="Heading2"/>
+      </w:pPr>
+      <w:r>
+        <w:t xml:space="preserve">3. Participants</w:t>
+      </w:r>
+    </w:p>
+    <w:p>
+      <w:pPr>
+        <w:pStyle w:val="FirstParagraph"/>
+      </w:pPr>
+      <w:r>
+        <w:t xml:space="preserve">The iFlow includes the following participants:</w:t>
+      </w:r>
+    </w:p>
+    <w:p>
+      <w:pPr>
+        <w:numPr>
+          <w:ilvl w:val="0"/>
+          <w:numId w:val="1005"/>
         </w:numPr>
         <w:pStyle w:val="Compact"/>
       </w:pPr>
@@ -134,14 +419,14 @@
         <w:t xml:space="preserve">Sender</w:t>
       </w:r>
       <w:r>
-        <w:t xml:space="preserve">: Represents the source of the data (Email Receiver).</w:t>
+        <w:t xml:space="preserve">: Represents the source of the email (IMAP).</w:t>
       </w:r>
     </w:p>
     <w:p>
       <w:pPr>
         <w:numPr>
-          <w:ilvl w:val="1"/>
-          <w:numId w:val="1002"/>
+          <w:ilvl w:val="0"/>
+          <w:numId w:val="1005"/>
         </w:numPr>
         <w:pStyle w:val="Compact"/>
       </w:pPr>
@@ -153,14 +438,14 @@
         <w:t xml:space="preserve">Receiver</w:t>
       </w:r>
       <w:r>
-        <w:t xml:space="preserve">: Represents the destination for the processed data (Email Sender).</w:t>
+        <w:t xml:space="preserve">: Represents the destination for the email (SMTP).</w:t>
       </w:r>
     </w:p>
     <w:p>
       <w:pPr>
         <w:numPr>
-          <w:ilvl w:val="1"/>
-          <w:numId w:val="1002"/>
+          <w:ilvl w:val="0"/>
+          <w:numId w:val="1005"/>
         </w:numPr>
         <w:pStyle w:val="Compact"/>
       </w:pPr>
@@ -172,43 +457,33 @@
         <w:t xml:space="preserve">Integration Process</w:t>
       </w:r>
       <w:r>
-        <w:t xml:space="preserve">: The main processing logic of the integration flow.</w:t>
+        <w:t xml:space="preserve">: The main processing logic of the iFlow.</w:t>
       </w:r>
     </w:p>
-    <w:bookmarkEnd w:id="21"/>
-    <w:bookmarkStart w:id="22" w:name="message-flows"/>
+    <w:bookmarkEnd w:id="22"/>
+    <w:bookmarkStart w:id="25" w:name="message-flows"/>
     <w:p>
       <w:pPr>
+        <w:pStyle w:val="Heading2"/>
+      </w:pPr>
+      <w:r>
+        <w:t xml:space="preserve">4. Message Flows</w:t>
+      </w:r>
+    </w:p>
+    <w:bookmarkStart w:id="23" w:name="message-flow-from-sender-to-start-event"/>
+    <w:p>
+      <w:pPr>
         <w:pStyle w:val="Heading3"/>
       </w:pPr>
       <w:r>
-        <w:t xml:space="preserve">Message Flows</w:t>
+        <w:t xml:space="preserve">4.1. Message Flow from Sender to Start Event</w:t>
       </w:r>
     </w:p>
     <w:p>
       <w:pPr>
         <w:numPr>
           <w:ilvl w:val="0"/>
-          <w:numId w:val="1003"/>
-        </w:numPr>
-        <w:pStyle w:val="Compact"/>
-      </w:pPr>
-      <w:r>
-        <w:rPr>
-          <w:bCs/>
-          <w:b/>
-        </w:rPr>
-        <w:t xml:space="preserve">Message Flow from Sender to Start Event</w:t>
-      </w:r>
-      <w:r>
-        <w:t xml:space="preserve">:</w:t>
-      </w:r>
-    </w:p>
-    <w:p>
-      <w:pPr>
-        <w:numPr>
-          <w:ilvl w:val="1"/>
-          <w:numId w:val="1004"/>
+          <w:numId w:val="1006"/>
         </w:numPr>
         <w:pStyle w:val="Compact"/>
       </w:pPr>
@@ -220,14 +495,14 @@
         <w:t xml:space="preserve">Source</w:t>
       </w:r>
       <w:r>
-        <w:t xml:space="preserve">: Sender (IMAP)</w:t>
+        <w:t xml:space="preserve">: Participant_1 (Sender)</w:t>
       </w:r>
     </w:p>
     <w:p>
       <w:pPr>
         <w:numPr>
-          <w:ilvl w:val="1"/>
-          <w:numId w:val="1004"/>
+          <w:ilvl w:val="0"/>
+          <w:numId w:val="1006"/>
         </w:numPr>
         <w:pStyle w:val="Compact"/>
       </w:pPr>
@@ -239,14 +514,14 @@
         <w:t xml:space="preserve">Target</w:t>
       </w:r>
       <w:r>
-        <w:t xml:space="preserve">: Start Event</w:t>
+        <w:t xml:space="preserve">: StartEvent_2</w:t>
       </w:r>
     </w:p>
     <w:p>
       <w:pPr>
         <w:numPr>
-          <w:ilvl w:val="1"/>
-          <w:numId w:val="1004"/>
+          <w:ilvl w:val="0"/>
+          <w:numId w:val="1006"/>
         </w:numPr>
         <w:pStyle w:val="Compact"/>
       </w:pPr>
@@ -255,29 +530,22 @@
           <w:bCs/>
           <w:b/>
         </w:rPr>
-        <w:t xml:space="preserve">Protocol</w:t>
-      </w:r>
-      <w:r>
-        <w:t xml:space="preserve">: IMAP</w:t>
+        <w:t xml:space="preserve">Properties</w:t>
+      </w:r>
+      <w:r>
+        <w:t xml:space="preserve">:</w:t>
       </w:r>
     </w:p>
     <w:p>
       <w:pPr>
         <w:numPr>
           <w:ilvl w:val="1"/>
-          <w:numId w:val="1004"/>
+          <w:numId w:val="1007"/>
         </w:numPr>
         <w:pStyle w:val="Compact"/>
       </w:pPr>
       <w:r>
-        <w:rPr>
-          <w:bCs/>
-          <w:b/>
-        </w:rPr>
-        <w:t xml:space="preserve">Server</w:t>
-      </w:r>
-      <w:r>
-        <w:t xml:space="preserve">:</w:t>
+        <w:t xml:space="preserve">Server:</w:t>
       </w:r>
       <w:r>
         <w:t xml:space="preserve"> </w:t>
@@ -293,19 +561,12 @@
       <w:pPr>
         <w:numPr>
           <w:ilvl w:val="1"/>
-          <w:numId w:val="1004"/>
+          <w:numId w:val="1007"/>
         </w:numPr>
         <w:pStyle w:val="Compact"/>
       </w:pPr>
       <w:r>
-        <w:rPr>
-          <w:bCs/>
-          <w:b/>
-        </w:rPr>
-        <w:t xml:space="preserve">User</w:t>
-      </w:r>
-      <w:r>
-        <w:t xml:space="preserve">:</w:t>
+        <w:t xml:space="preserve">Authentication:</w:t>
       </w:r>
       <w:r>
         <w:t xml:space="preserve"> </w:t>
@@ -314,26 +575,61 @@
         <w:rPr>
           <w:rStyle w:val="VerbatimChar"/>
         </w:rPr>
-        <w:t xml:space="preserve">GMAIL_SINDHU</w:t>
+        <w:t xml:space="preserve">loginPlain</w:t>
       </w:r>
     </w:p>
     <w:p>
       <w:pPr>
         <w:numPr>
           <w:ilvl w:val="1"/>
-          <w:numId w:val="1004"/>
+          <w:numId w:val="1007"/>
         </w:numPr>
         <w:pStyle w:val="Compact"/>
       </w:pPr>
       <w:r>
+        <w:t xml:space="preserve">SSL:</w:t>
+      </w:r>
+      <w:r>
+        <w:t xml:space="preserve"> </w:t>
+      </w:r>
+      <w:r>
         <w:rPr>
-          <w:bCs/>
-          <w:b/>
+          <w:rStyle w:val="VerbatimChar"/>
         </w:rPr>
-        <w:t xml:space="preserve">Folder</w:t>
-      </w:r>
-      <w:r>
-        <w:t xml:space="preserve">:</w:t>
+        <w:t xml:space="preserve">imaps</w:t>
+      </w:r>
+    </w:p>
+    <w:p>
+      <w:pPr>
+        <w:numPr>
+          <w:ilvl w:val="1"/>
+          <w:numId w:val="1007"/>
+        </w:numPr>
+        <w:pStyle w:val="Compact"/>
+      </w:pPr>
+      <w:r>
+        <w:t xml:space="preserve">Max Messages Per Poll:</w:t>
+      </w:r>
+      <w:r>
+        <w:t xml:space="preserve"> </w:t>
+      </w:r>
+      <w:r>
+        <w:rPr>
+          <w:rStyle w:val="VerbatimChar"/>
+        </w:rPr>
+        <w:t xml:space="preserve">20</w:t>
+      </w:r>
+    </w:p>
+    <w:p>
+      <w:pPr>
+        <w:numPr>
+          <w:ilvl w:val="1"/>
+          <w:numId w:val="1007"/>
+        </w:numPr>
+        <w:pStyle w:val="Compact"/>
+      </w:pPr>
+      <w:r>
+        <w:t xml:space="preserve">Folder:</w:t>
       </w:r>
       <w:r>
         <w:t xml:space="preserve"> </w:t>
@@ -349,138 +645,29 @@
       <w:pPr>
         <w:numPr>
           <w:ilvl w:val="1"/>
-          <w:numId w:val="1004"/>
+          <w:numId w:val="1007"/>
         </w:numPr>
         <w:pStyle w:val="Compact"/>
       </w:pPr>
       <w:r>
-        <w:rPr>
-          <w:bCs/>
-          <w:b/>
-        </w:rPr>
-        <w:t xml:space="preserve">Max Messages Per Poll</w:t>
-      </w:r>
-      <w:r>
-        <w:t xml:space="preserve">:</w:t>
-      </w:r>
-      <w:r>
-        <w:t xml:space="preserve"> </w:t>
-      </w:r>
-      <w:r>
-        <w:rPr>
-          <w:rStyle w:val="VerbatimChar"/>
-        </w:rPr>
-        <w:t xml:space="preserve">20</w:t>
+        <w:t xml:space="preserve">Schedule Key: Configured for daily polling.</w:t>
+      </w:r>
+    </w:p>
+    <w:bookmarkEnd w:id="23"/>
+    <w:bookmarkStart w:id="24" w:name="message-flow-from-end-event-to-receiver"/>
+    <w:p>
+      <w:pPr>
+        <w:pStyle w:val="Heading3"/>
+      </w:pPr>
+      <w:r>
+        <w:t xml:space="preserve">4.2. Message Flow from End Event to Receiver</w:t>
       </w:r>
     </w:p>
     <w:p>
       <w:pPr>
         <w:numPr>
-          <w:ilvl w:val="1"/>
-          <w:numId w:val="1004"/>
-        </w:numPr>
-        <w:pStyle w:val="Compact"/>
-      </w:pPr>
-      <w:r>
-        <w:rPr>
-          <w:bCs/>
-          <w:b/>
-        </w:rPr>
-        <w:t xml:space="preserve">Selection Read Flag</w:t>
-      </w:r>
-      <w:r>
-        <w:t xml:space="preserve">:</w:t>
-      </w:r>
-      <w:r>
-        <w:t xml:space="preserve"> </w:t>
-      </w:r>
-      <w:r>
-        <w:rPr>
-          <w:rStyle w:val="VerbatimChar"/>
-        </w:rPr>
-        <w:t xml:space="preserve">unread</w:t>
-      </w:r>
-    </w:p>
-    <w:p>
-      <w:pPr>
-        <w:numPr>
-          <w:ilvl w:val="1"/>
-          <w:numId w:val="1004"/>
-        </w:numPr>
-        <w:pStyle w:val="Compact"/>
-      </w:pPr>
-      <w:r>
-        <w:rPr>
-          <w:bCs/>
-          <w:b/>
-        </w:rPr>
-        <w:t xml:space="preserve">SSL</w:t>
-      </w:r>
-      <w:r>
-        <w:t xml:space="preserve">:</w:t>
-      </w:r>
-      <w:r>
-        <w:t xml:space="preserve"> </w:t>
-      </w:r>
-      <w:r>
-        <w:rPr>
-          <w:rStyle w:val="VerbatimChar"/>
-        </w:rPr>
-        <w:t xml:space="preserve">imaps</w:t>
-      </w:r>
-    </w:p>
-    <w:p>
-      <w:pPr>
-        <w:numPr>
-          <w:ilvl w:val="1"/>
-          <w:numId w:val="1004"/>
-        </w:numPr>
-        <w:pStyle w:val="Compact"/>
-      </w:pPr>
-      <w:r>
-        <w:rPr>
-          <w:bCs/>
-          <w:b/>
-        </w:rPr>
-        <w:t xml:space="preserve">Timeout</w:t>
-      </w:r>
-      <w:r>
-        <w:t xml:space="preserve">:</w:t>
-      </w:r>
-      <w:r>
-        <w:t xml:space="preserve"> </w:t>
-      </w:r>
-      <w:r>
-        <w:rPr>
-          <w:rStyle w:val="VerbatimChar"/>
-        </w:rPr>
-        <w:t xml:space="preserve">3000 ms</w:t>
-      </w:r>
-    </w:p>
-    <w:p>
-      <w:pPr>
-        <w:numPr>
           <w:ilvl w:val="0"/>
-          <w:numId w:val="1003"/>
-        </w:numPr>
-        <w:pStyle w:val="Compact"/>
-      </w:pPr>
-      <w:r>
-        <w:rPr>
-          <w:bCs/>
-          <w:b/>
-        </w:rPr>
-        <w:t xml:space="preserve">Message Flow from End Event to Receiver</w:t>
-      </w:r>
-      <w:r>
-        <w:t xml:space="preserve">:</w:t>
-      </w:r>
-    </w:p>
-    <w:p>
-      <w:pPr>
-        <w:numPr>
-          <w:ilvl w:val="1"/>
-          <w:numId w:val="1005"/>
+          <w:numId w:val="1008"/>
         </w:numPr>
         <w:pStyle w:val="Compact"/>
       </w:pPr>
@@ -492,14 +679,14 @@
         <w:t xml:space="preserve">Source</w:t>
       </w:r>
       <w:r>
-        <w:t xml:space="preserve">: End Event</w:t>
+        <w:t xml:space="preserve">: EndEvent_2</w:t>
       </w:r>
     </w:p>
     <w:p>
       <w:pPr>
         <w:numPr>
-          <w:ilvl w:val="1"/>
-          <w:numId w:val="1005"/>
+          <w:ilvl w:val="0"/>
+          <w:numId w:val="1008"/>
         </w:numPr>
         <w:pStyle w:val="Compact"/>
       </w:pPr>
@@ -511,14 +698,14 @@
         <w:t xml:space="preserve">Target</w:t>
       </w:r>
       <w:r>
-        <w:t xml:space="preserve">: Receiver (SMTP)</w:t>
+        <w:t xml:space="preserve">: Participant_2 (Receiver)</w:t>
       </w:r>
     </w:p>
     <w:p>
       <w:pPr>
         <w:numPr>
-          <w:ilvl w:val="1"/>
-          <w:numId w:val="1005"/>
+          <w:ilvl w:val="0"/>
+          <w:numId w:val="1008"/>
         </w:numPr>
         <w:pStyle w:val="Compact"/>
       </w:pPr>
@@ -527,17 +714,175 @@
           <w:bCs/>
           <w:b/>
         </w:rPr>
-        <w:t xml:space="preserve">Protocol</w:t>
-      </w:r>
-      <w:r>
-        <w:t xml:space="preserve">: SMTP</w:t>
+        <w:t xml:space="preserve">Properties</w:t>
+      </w:r>
+      <w:r>
+        <w:t xml:space="preserve">:</w:t>
       </w:r>
     </w:p>
     <w:p>
       <w:pPr>
         <w:numPr>
           <w:ilvl w:val="1"/>
-          <w:numId w:val="1005"/>
+          <w:numId w:val="1009"/>
+        </w:numPr>
+        <w:pStyle w:val="Compact"/>
+      </w:pPr>
+      <w:r>
+        <w:t xml:space="preserve">Server:</w:t>
+      </w:r>
+      <w:r>
+        <w:t xml:space="preserve"> </w:t>
+      </w:r>
+      <w:r>
+        <w:rPr>
+          <w:rStyle w:val="VerbatimChar"/>
+        </w:rPr>
+        <w:t xml:space="preserve">smtp.gmail.com</w:t>
+      </w:r>
+    </w:p>
+    <w:p>
+      <w:pPr>
+        <w:numPr>
+          <w:ilvl w:val="1"/>
+          <w:numId w:val="1009"/>
+        </w:numPr>
+        <w:pStyle w:val="Compact"/>
+      </w:pPr>
+      <w:r>
+        <w:t xml:space="preserve">Authentication:</w:t>
+      </w:r>
+      <w:r>
+        <w:t xml:space="preserve"> </w:t>
+      </w:r>
+      <w:r>
+        <w:rPr>
+          <w:rStyle w:val="VerbatimChar"/>
+        </w:rPr>
+        <w:t xml:space="preserve">loginPlain</w:t>
+      </w:r>
+    </w:p>
+    <w:p>
+      <w:pPr>
+        <w:numPr>
+          <w:ilvl w:val="1"/>
+          <w:numId w:val="1009"/>
+        </w:numPr>
+        <w:pStyle w:val="Compact"/>
+      </w:pPr>
+      <w:r>
+        <w:t xml:space="preserve">Subject:</w:t>
+      </w:r>
+      <w:r>
+        <w:t xml:space="preserve"> </w:t>
+      </w:r>
+      <w:r>
+        <w:rPr>
+          <w:rStyle w:val="VerbatimChar"/>
+        </w:rPr>
+        <w:t xml:space="preserve">XML DATA</w:t>
+      </w:r>
+    </w:p>
+    <w:p>
+      <w:pPr>
+        <w:numPr>
+          <w:ilvl w:val="1"/>
+          <w:numId w:val="1009"/>
+        </w:numPr>
+        <w:pStyle w:val="Compact"/>
+      </w:pPr>
+      <w:r>
+        <w:t xml:space="preserve">From:</w:t>
+      </w:r>
+      <w:r>
+        <w:t xml:space="preserve"> </w:t>
+      </w:r>
+      <w:r>
+        <w:rPr>
+          <w:rStyle w:val="VerbatimChar"/>
+        </w:rPr>
+        <w:t xml:space="preserve">sindhukv898@gmail.com</w:t>
+      </w:r>
+    </w:p>
+    <w:p>
+      <w:pPr>
+        <w:numPr>
+          <w:ilvl w:val="1"/>
+          <w:numId w:val="1009"/>
+        </w:numPr>
+        <w:pStyle w:val="Compact"/>
+      </w:pPr>
+      <w:r>
+        <w:t xml:space="preserve">To:</w:t>
+      </w:r>
+      <w:r>
+        <w:t xml:space="preserve"> </w:t>
+      </w:r>
+      <w:r>
+        <w:rPr>
+          <w:rStyle w:val="VerbatimChar"/>
+        </w:rPr>
+        <w:t xml:space="preserve">sindhu.kv@motiveminds.com</w:t>
+      </w:r>
+    </w:p>
+    <w:p>
+      <w:pPr>
+        <w:numPr>
+          <w:ilvl w:val="1"/>
+          <w:numId w:val="1009"/>
+        </w:numPr>
+        <w:pStyle w:val="Compact"/>
+      </w:pPr>
+      <w:r>
+        <w:t xml:space="preserve">Content Type:</w:t>
+      </w:r>
+      <w:r>
+        <w:t xml:space="preserve"> </w:t>
+      </w:r>
+      <w:r>
+        <w:rPr>
+          <w:rStyle w:val="VerbatimChar"/>
+        </w:rPr>
+        <w:t xml:space="preserve">text/plain</w:t>
+      </w:r>
+    </w:p>
+    <w:p>
+      <w:pPr>
+        <w:numPr>
+          <w:ilvl w:val="1"/>
+          <w:numId w:val="1009"/>
+        </w:numPr>
+        <w:pStyle w:val="Compact"/>
+      </w:pPr>
+      <w:r>
+        <w:t xml:space="preserve">Attachments: XML data as an attachment.</w:t>
+      </w:r>
+    </w:p>
+    <w:bookmarkEnd w:id="24"/>
+    <w:bookmarkEnd w:id="25"/>
+    <w:bookmarkStart w:id="31" w:name="process-details"/>
+    <w:p>
+      <w:pPr>
+        <w:pStyle w:val="Heading2"/>
+      </w:pPr>
+      <w:r>
+        <w:t xml:space="preserve">5. Process Details</w:t>
+      </w:r>
+    </w:p>
+    <w:bookmarkStart w:id="26" w:name="integration-process"/>
+    <w:p>
+      <w:pPr>
+        <w:pStyle w:val="Heading3"/>
+      </w:pPr>
+      <w:r>
+        <w:t xml:space="preserve">5.1. Integration Process</w:t>
+      </w:r>
+    </w:p>
+    <w:p>
+      <w:pPr>
+        <w:numPr>
+          <w:ilvl w:val="0"/>
+          <w:numId w:val="1010"/>
         </w:numPr>
         <w:pStyle w:val="Compact"/>
       </w:pPr>
@@ -546,251 +891,17 @@
           <w:bCs/>
           <w:b/>
         </w:rPr>
-        <w:t xml:space="preserve">Server</w:t>
-      </w:r>
-      <w:r>
-        <w:t xml:space="preserve">:</w:t>
-      </w:r>
-      <w:r>
-        <w:t xml:space="preserve"> </w:t>
-      </w:r>
-      <w:r>
-        <w:rPr>
-          <w:rStyle w:val="VerbatimChar"/>
-        </w:rPr>
-        <w:t xml:space="preserve">smtp.gmail.com</w:t>
+        <w:t xml:space="preserve">ID</w:t>
+      </w:r>
+      <w:r>
+        <w:t xml:space="preserve">: Process_1</w:t>
       </w:r>
     </w:p>
     <w:p>
       <w:pPr>
         <w:numPr>
-          <w:ilvl w:val="1"/>
-          <w:numId w:val="1005"/>
-        </w:numPr>
-        <w:pStyle w:val="Compact"/>
-      </w:pPr>
-      <w:r>
-        <w:rPr>
-          <w:bCs/>
-          <w:b/>
-        </w:rPr>
-        <w:t xml:space="preserve">From</w:t>
-      </w:r>
-      <w:r>
-        <w:t xml:space="preserve">:</w:t>
-      </w:r>
-      <w:r>
-        <w:t xml:space="preserve"> </w:t>
-      </w:r>
-      <w:r>
-        <w:rPr>
-          <w:rStyle w:val="VerbatimChar"/>
-        </w:rPr>
-        <w:t xml:space="preserve">sindhukv898@gmail.com</w:t>
-      </w:r>
-    </w:p>
-    <w:p>
-      <w:pPr>
-        <w:numPr>
-          <w:ilvl w:val="1"/>
-          <w:numId w:val="1005"/>
-        </w:numPr>
-        <w:pStyle w:val="Compact"/>
-      </w:pPr>
-      <w:r>
-        <w:rPr>
-          <w:bCs/>
-          <w:b/>
-        </w:rPr>
-        <w:t xml:space="preserve">To</w:t>
-      </w:r>
-      <w:r>
-        <w:t xml:space="preserve">:</w:t>
-      </w:r>
-      <w:r>
-        <w:t xml:space="preserve"> </w:t>
-      </w:r>
-      <w:r>
-        <w:rPr>
-          <w:rStyle w:val="VerbatimChar"/>
-        </w:rPr>
-        <w:t xml:space="preserve">sindhu.kv@motiveminds.com</w:t>
-      </w:r>
-    </w:p>
-    <w:p>
-      <w:pPr>
-        <w:numPr>
-          <w:ilvl w:val="1"/>
-          <w:numId w:val="1005"/>
-        </w:numPr>
-        <w:pStyle w:val="Compact"/>
-      </w:pPr>
-      <w:r>
-        <w:rPr>
-          <w:bCs/>
-          <w:b/>
-        </w:rPr>
-        <w:t xml:space="preserve">Subject</w:t>
-      </w:r>
-      <w:r>
-        <w:t xml:space="preserve">:</w:t>
-      </w:r>
-      <w:r>
-        <w:t xml:space="preserve"> </w:t>
-      </w:r>
-      <w:r>
-        <w:rPr>
-          <w:rStyle w:val="VerbatimChar"/>
-        </w:rPr>
-        <w:t xml:space="preserve">XML DATA</w:t>
-      </w:r>
-    </w:p>
-    <w:p>
-      <w:pPr>
-        <w:numPr>
-          <w:ilvl w:val="1"/>
-          <w:numId w:val="1005"/>
-        </w:numPr>
-        <w:pStyle w:val="Compact"/>
-      </w:pPr>
-      <w:r>
-        <w:rPr>
-          <w:bCs/>
-          <w:b/>
-        </w:rPr>
-        <w:t xml:space="preserve">Body</w:t>
-      </w:r>
-      <w:r>
-        <w:t xml:space="preserve">:</w:t>
-      </w:r>
-      <w:r>
-        <w:t xml:space="preserve"> </w:t>
-      </w:r>
-      <w:r>
-        <w:rPr>
-          <w:rStyle w:val="VerbatimChar"/>
-        </w:rPr>
-        <w:t xml:space="preserve">Find attachment</w:t>
-      </w:r>
-    </w:p>
-    <w:p>
-      <w:pPr>
-        <w:numPr>
-          <w:ilvl w:val="1"/>
-          <w:numId w:val="1005"/>
-        </w:numPr>
-        <w:pStyle w:val="Compact"/>
-      </w:pPr>
-      <w:r>
-        <w:rPr>
-          <w:bCs/>
-          <w:b/>
-        </w:rPr>
-        <w:t xml:space="preserve">Attachments</w:t>
-      </w:r>
-      <w:r>
-        <w:t xml:space="preserve">: XML data</w:t>
-      </w:r>
-    </w:p>
-    <w:p>
-      <w:pPr>
-        <w:numPr>
-          <w:ilvl w:val="1"/>
-          <w:numId w:val="1005"/>
-        </w:numPr>
-        <w:pStyle w:val="Compact"/>
-      </w:pPr>
-      <w:r>
-        <w:rPr>
-          <w:bCs/>
-          <w:b/>
-        </w:rPr>
-        <w:t xml:space="preserve">Timeout</w:t>
-      </w:r>
-      <w:r>
-        <w:t xml:space="preserve">:</w:t>
-      </w:r>
-      <w:r>
-        <w:t xml:space="preserve"> </w:t>
-      </w:r>
-      <w:r>
-        <w:rPr>
-          <w:rStyle w:val="VerbatimChar"/>
-        </w:rPr>
-        <w:t xml:space="preserve">30000 ms</w:t>
-      </w:r>
-    </w:p>
-    <w:bookmarkEnd w:id="22"/>
-    <w:bookmarkStart w:id="23" w:name="process-definition"/>
-    <w:p>
-      <w:pPr>
-        <w:pStyle w:val="Heading3"/>
-      </w:pPr>
-      <w:r>
-        <w:t xml:space="preserve">Process Definition</w:t>
-      </w:r>
-    </w:p>
-    <w:p>
-      <w:pPr>
-        <w:numPr>
           <w:ilvl w:val="0"/>
-          <w:numId w:val="1006"/>
-        </w:numPr>
-        <w:pStyle w:val="Compact"/>
-      </w:pPr>
-      <w:r>
-        <w:rPr>
-          <w:bCs/>
-          <w:b/>
-        </w:rPr>
-        <w:t xml:space="preserve">Process ID</w:t>
-      </w:r>
-      <w:r>
-        <w:t xml:space="preserve">:</w:t>
-      </w:r>
-      <w:r>
-        <w:t xml:space="preserve"> </w:t>
-      </w:r>
-      <w:r>
-        <w:rPr>
-          <w:rStyle w:val="VerbatimChar"/>
-        </w:rPr>
-        <w:t xml:space="preserve">Process_1</w:t>
-      </w:r>
-    </w:p>
-    <w:p>
-      <w:pPr>
-        <w:numPr>
-          <w:ilvl w:val="0"/>
-          <w:numId w:val="1006"/>
-        </w:numPr>
-        <w:pStyle w:val="Compact"/>
-      </w:pPr>
-      <w:r>
-        <w:rPr>
-          <w:bCs/>
-          <w:b/>
-        </w:rPr>
-        <w:t xml:space="preserve">Name</w:t>
-      </w:r>
-      <w:r>
-        <w:t xml:space="preserve">:</w:t>
-      </w:r>
-      <w:r>
-        <w:t xml:space="preserve"> </w:t>
-      </w:r>
-      <w:r>
-        <w:rPr>
-          <w:rStyle w:val="VerbatimChar"/>
-        </w:rPr>
-        <w:t xml:space="preserve">Integration Process</w:t>
-      </w:r>
-    </w:p>
-    <w:p>
-      <w:pPr>
-        <w:numPr>
-          <w:ilvl w:val="0"/>
-          <w:numId w:val="1006"/>
+          <w:numId w:val="1010"/>
         </w:numPr>
         <w:pStyle w:val="Compact"/>
       </w:pPr>
@@ -802,23 +913,14 @@
         <w:t xml:space="preserve">Transaction Timeout</w:t>
       </w:r>
       <w:r>
-        <w:t xml:space="preserve">:</w:t>
-      </w:r>
-      <w:r>
-        <w:t xml:space="preserve"> </w:t>
-      </w:r>
-      <w:r>
-        <w:rPr>
-          <w:rStyle w:val="VerbatimChar"/>
-        </w:rPr>
-        <w:t xml:space="preserve">30 seconds</w:t>
+        <w:t xml:space="preserve">: 30 seconds</w:t>
       </w:r>
     </w:p>
     <w:p>
       <w:pPr>
         <w:numPr>
           <w:ilvl w:val="0"/>
-          <w:numId w:val="1006"/>
+          <w:numId w:val="1010"/>
         </w:numPr>
         <w:pStyle w:val="Compact"/>
       </w:pPr>
@@ -830,33 +932,33 @@
         <w:t xml:space="preserve">Transactional Handling</w:t>
       </w:r>
       <w:r>
-        <w:t xml:space="preserve">:</w:t>
-      </w:r>
-      <w:r>
-        <w:t xml:space="preserve"> </w:t>
-      </w:r>
-      <w:r>
-        <w:rPr>
-          <w:rStyle w:val="VerbatimChar"/>
-        </w:rPr>
-        <w:t xml:space="preserve">Not Required</w:t>
+        <w:t xml:space="preserve">: Not Required</w:t>
       </w:r>
     </w:p>
-    <w:bookmarkEnd w:id="23"/>
-    <w:bookmarkStart w:id="24" w:name="activities"/>
+    <w:bookmarkEnd w:id="26"/>
+    <w:bookmarkStart w:id="30" w:name="call-activities"/>
     <w:p>
       <w:pPr>
         <w:pStyle w:val="Heading3"/>
       </w:pPr>
       <w:r>
-        <w:t xml:space="preserve">Activities</w:t>
+        <w:t xml:space="preserve">5.2. Call Activities</w:t>
+      </w:r>
+    </w:p>
+    <w:bookmarkStart w:id="27" w:name="groovy-script-1"/>
+    <w:p>
+      <w:pPr>
+        <w:pStyle w:val="Heading4"/>
+      </w:pPr>
+      <w:r>
+        <w:t xml:space="preserve">5.2.1. Groovy Script 1</w:t>
       </w:r>
     </w:p>
     <w:p>
       <w:pPr>
         <w:numPr>
           <w:ilvl w:val="0"/>
-          <w:numId w:val="1007"/>
+          <w:numId w:val="1011"/>
         </w:numPr>
         <w:pStyle w:val="Compact"/>
       </w:pPr>
@@ -865,36 +967,17 @@
           <w:bCs/>
           <w:b/>
         </w:rPr>
-        <w:t xml:space="preserve">Start Event</w:t>
-      </w:r>
-      <w:r>
-        <w:t xml:space="preserve">: Initiates the integration flow.</w:t>
+        <w:t xml:space="preserve">ID</w:t>
+      </w:r>
+      <w:r>
+        <w:t xml:space="preserve">: CallActivity_33462155</w:t>
       </w:r>
     </w:p>
     <w:p>
       <w:pPr>
         <w:numPr>
           <w:ilvl w:val="0"/>
-          <w:numId w:val="1007"/>
-        </w:numPr>
-        <w:pStyle w:val="Compact"/>
-      </w:pPr>
-      <w:r>
-        <w:rPr>
-          <w:bCs/>
-          <w:b/>
-        </w:rPr>
-        <w:t xml:space="preserve">Call Activity - Groovy Script 1</w:t>
-      </w:r>
-      <w:r>
-        <w:t xml:space="preserve">: Executes a Groovy script for processing the incoming data.</w:t>
-      </w:r>
-    </w:p>
-    <w:p>
-      <w:pPr>
-        <w:numPr>
-          <w:ilvl w:val="1"/>
-          <w:numId w:val="1008"/>
+          <w:numId w:val="1011"/>
         </w:numPr>
         <w:pStyle w:val="Compact"/>
       </w:pPr>
@@ -922,7 +1005,7 @@
       <w:pPr>
         <w:numPr>
           <w:ilvl w:val="0"/>
-          <w:numId w:val="1007"/>
+          <w:numId w:val="1011"/>
         </w:numPr>
         <w:pStyle w:val="Compact"/>
       </w:pPr>
@@ -931,17 +1014,27 @@
           <w:bCs/>
           <w:b/>
         </w:rPr>
-        <w:t xml:space="preserve">Call Activity - Content Modifier 1</w:t>
-      </w:r>
-      <w:r>
-        <w:t xml:space="preserve">: Modifies the content of the message.</w:t>
+        <w:t xml:space="preserve">Component Version</w:t>
+      </w:r>
+      <w:r>
+        <w:t xml:space="preserve">: 1.1</w:t>
+      </w:r>
+    </w:p>
+    <w:bookmarkEnd w:id="27"/>
+    <w:bookmarkStart w:id="28" w:name="content-modifier-1"/>
+    <w:p>
+      <w:pPr>
+        <w:pStyle w:val="Heading4"/>
+      </w:pPr>
+      <w:r>
+        <w:t xml:space="preserve">5.2.2. Content Modifier 1</w:t>
       </w:r>
     </w:p>
     <w:p>
       <w:pPr>
         <w:numPr>
           <w:ilvl w:val="0"/>
-          <w:numId w:val="1007"/>
+          <w:numId w:val="1012"/>
         </w:numPr>
         <w:pStyle w:val="Compact"/>
       </w:pPr>
@@ -950,17 +1043,17 @@
           <w:bCs/>
           <w:b/>
         </w:rPr>
-        <w:t xml:space="preserve">Call Activity - Content Modifier 2</w:t>
-      </w:r>
-      <w:r>
-        <w:t xml:space="preserve">: Further modifies the content of the message.</w:t>
+        <w:t xml:space="preserve">ID</w:t>
+      </w:r>
+      <w:r>
+        <w:t xml:space="preserve">: CallActivity_33462159</w:t>
       </w:r>
     </w:p>
     <w:p>
       <w:pPr>
         <w:numPr>
           <w:ilvl w:val="0"/>
-          <w:numId w:val="1007"/>
+          <w:numId w:val="1012"/>
         </w:numPr>
         <w:pStyle w:val="Compact"/>
       </w:pPr>
@@ -969,27 +1062,17 @@
           <w:bCs/>
           <w:b/>
         </w:rPr>
-        <w:t xml:space="preserve">End Event</w:t>
-      </w:r>
-      <w:r>
-        <w:t xml:space="preserve">: Marks the completion of the integration flow.</w:t>
-      </w:r>
-    </w:p>
-    <w:bookmarkEnd w:id="24"/>
-    <w:bookmarkStart w:id="25" w:name="properties"/>
-    <w:p>
-      <w:pPr>
-        <w:pStyle w:val="Heading3"/>
-      </w:pPr>
-      <w:r>
-        <w:t xml:space="preserve">Properties</w:t>
+        <w:t xml:space="preserve">Body Type</w:t>
+      </w:r>
+      <w:r>
+        <w:t xml:space="preserve">: Constant</w:t>
       </w:r>
     </w:p>
     <w:p>
       <w:pPr>
         <w:numPr>
           <w:ilvl w:val="0"/>
-          <w:numId w:val="1009"/>
+          <w:numId w:val="1012"/>
         </w:numPr>
         <w:pStyle w:val="Compact"/>
       </w:pPr>
@@ -998,17 +1081,268 @@
           <w:bCs/>
           <w:b/>
         </w:rPr>
-        <w:t xml:space="preserve">Logging</w:t>
-      </w:r>
-      <w:r>
-        <w:t xml:space="preserve">: All events are logged.</w:t>
+        <w:t xml:space="preserve">Component Version</w:t>
+      </w:r>
+      <w:r>
+        <w:t xml:space="preserve">: 1.6</w:t>
+      </w:r>
+    </w:p>
+    <w:bookmarkEnd w:id="28"/>
+    <w:bookmarkStart w:id="29" w:name="content-modifier-2"/>
+    <w:p>
+      <w:pPr>
+        <w:pStyle w:val="Heading4"/>
+      </w:pPr>
+      <w:r>
+        <w:t xml:space="preserve">5.2.3. Content Modifier 2</w:t>
       </w:r>
     </w:p>
     <w:p>
       <w:pPr>
         <w:numPr>
           <w:ilvl w:val="0"/>
-          <w:numId w:val="1009"/>
+          <w:numId w:val="1013"/>
+        </w:numPr>
+        <w:pStyle w:val="Compact"/>
+      </w:pPr>
+      <w:r>
+        <w:rPr>
+          <w:bCs/>
+          <w:b/>
+        </w:rPr>
+        <w:t xml:space="preserve">ID</w:t>
+      </w:r>
+      <w:r>
+        <w:t xml:space="preserve">: CallActivity_33462160</w:t>
+      </w:r>
+    </w:p>
+    <w:p>
+      <w:pPr>
+        <w:numPr>
+          <w:ilvl w:val="0"/>
+          <w:numId w:val="1013"/>
+        </w:numPr>
+        <w:pStyle w:val="Compact"/>
+      </w:pPr>
+      <w:r>
+        <w:rPr>
+          <w:bCs/>
+          <w:b/>
+        </w:rPr>
+        <w:t xml:space="preserve">Body Type</w:t>
+      </w:r>
+      <w:r>
+        <w:t xml:space="preserve">: Constant</w:t>
+      </w:r>
+    </w:p>
+    <w:p>
+      <w:pPr>
+        <w:numPr>
+          <w:ilvl w:val="0"/>
+          <w:numId w:val="1013"/>
+        </w:numPr>
+        <w:pStyle w:val="Compact"/>
+      </w:pPr>
+      <w:r>
+        <w:rPr>
+          <w:bCs/>
+          <w:b/>
+        </w:rPr>
+        <w:t xml:space="preserve">Component Version</w:t>
+      </w:r>
+      <w:r>
+        <w:t xml:space="preserve">: 1.6</w:t>
+      </w:r>
+    </w:p>
+    <w:bookmarkEnd w:id="29"/>
+    <w:bookmarkEnd w:id="30"/>
+    <w:bookmarkEnd w:id="31"/>
+    <w:bookmarkStart w:id="34" w:name="events"/>
+    <w:p>
+      <w:pPr>
+        <w:pStyle w:val="Heading2"/>
+      </w:pPr>
+      <w:r>
+        <w:t xml:space="preserve">6. Events</w:t>
+      </w:r>
+    </w:p>
+    <w:bookmarkStart w:id="32" w:name="start-event"/>
+    <w:p>
+      <w:pPr>
+        <w:pStyle w:val="Heading3"/>
+      </w:pPr>
+      <w:r>
+        <w:t xml:space="preserve">6.1. Start Event</w:t>
+      </w:r>
+    </w:p>
+    <w:p>
+      <w:pPr>
+        <w:numPr>
+          <w:ilvl w:val="0"/>
+          <w:numId w:val="1014"/>
+        </w:numPr>
+        <w:pStyle w:val="Compact"/>
+      </w:pPr>
+      <w:r>
+        <w:rPr>
+          <w:bCs/>
+          <w:b/>
+        </w:rPr>
+        <w:t xml:space="preserve">ID</w:t>
+      </w:r>
+      <w:r>
+        <w:t xml:space="preserve">: StartEvent_2</w:t>
+      </w:r>
+    </w:p>
+    <w:p>
+      <w:pPr>
+        <w:numPr>
+          <w:ilvl w:val="0"/>
+          <w:numId w:val="1014"/>
+        </w:numPr>
+        <w:pStyle w:val="Compact"/>
+      </w:pPr>
+      <w:r>
+        <w:rPr>
+          <w:bCs/>
+          <w:b/>
+        </w:rPr>
+        <w:t xml:space="preserve">Component Version</w:t>
+      </w:r>
+      <w:r>
+        <w:t xml:space="preserve">: 1.0</w:t>
+      </w:r>
+    </w:p>
+    <w:bookmarkEnd w:id="32"/>
+    <w:bookmarkStart w:id="33" w:name="end-event"/>
+    <w:p>
+      <w:pPr>
+        <w:pStyle w:val="Heading3"/>
+      </w:pPr>
+      <w:r>
+        <w:t xml:space="preserve">6.2. End Event</w:t>
+      </w:r>
+    </w:p>
+    <w:p>
+      <w:pPr>
+        <w:numPr>
+          <w:ilvl w:val="0"/>
+          <w:numId w:val="1015"/>
+        </w:numPr>
+        <w:pStyle w:val="Compact"/>
+      </w:pPr>
+      <w:r>
+        <w:rPr>
+          <w:bCs/>
+          <w:b/>
+        </w:rPr>
+        <w:t xml:space="preserve">ID</w:t>
+      </w:r>
+      <w:r>
+        <w:t xml:space="preserve">: EndEvent_2</w:t>
+      </w:r>
+    </w:p>
+    <w:p>
+      <w:pPr>
+        <w:numPr>
+          <w:ilvl w:val="0"/>
+          <w:numId w:val="1015"/>
+        </w:numPr>
+        <w:pStyle w:val="Compact"/>
+      </w:pPr>
+      <w:r>
+        <w:rPr>
+          <w:bCs/>
+          <w:b/>
+        </w:rPr>
+        <w:t xml:space="preserve">Component Version</w:t>
+      </w:r>
+      <w:r>
+        <w:t xml:space="preserve">: 1.1</w:t>
+      </w:r>
+    </w:p>
+    <w:bookmarkEnd w:id="33"/>
+    <w:bookmarkEnd w:id="34"/>
+    <w:bookmarkStart w:id="38" w:name="properties"/>
+    <w:p>
+      <w:pPr>
+        <w:pStyle w:val="Heading2"/>
+      </w:pPr>
+      <w:r>
+        <w:t xml:space="preserve">7. Properties</w:t>
+      </w:r>
+    </w:p>
+    <w:bookmarkStart w:id="35" w:name="global-properties"/>
+    <w:p>
+      <w:pPr>
+        <w:pStyle w:val="Heading3"/>
+      </w:pPr>
+      <w:r>
+        <w:t xml:space="preserve">7.1. Global Properties</w:t>
+      </w:r>
+    </w:p>
+    <w:p>
+      <w:pPr>
+        <w:numPr>
+          <w:ilvl w:val="0"/>
+          <w:numId w:val="1016"/>
+        </w:numPr>
+        <w:pStyle w:val="Compact"/>
+      </w:pPr>
+      <w:r>
+        <w:rPr>
+          <w:bCs/>
+          <w:b/>
+        </w:rPr>
+        <w:t xml:space="preserve">Namespace Mapping</w:t>
+      </w:r>
+      <w:r>
+        <w:t xml:space="preserve">: Not configured.</w:t>
+      </w:r>
+    </w:p>
+    <w:p>
+      <w:pPr>
+        <w:numPr>
+          <w:ilvl w:val="0"/>
+          <w:numId w:val="1016"/>
+        </w:numPr>
+        <w:pStyle w:val="Compact"/>
+      </w:pPr>
+      <w:r>
+        <w:rPr>
+          <w:bCs/>
+          <w:b/>
+        </w:rPr>
+        <w:t xml:space="preserve">HTTP Session Handling</w:t>
+      </w:r>
+      <w:r>
+        <w:t xml:space="preserve">: None</w:t>
+      </w:r>
+    </w:p>
+    <w:p>
+      <w:pPr>
+        <w:numPr>
+          <w:ilvl w:val="0"/>
+          <w:numId w:val="1016"/>
+        </w:numPr>
+        <w:pStyle w:val="Compact"/>
+      </w:pPr>
+      <w:r>
+        <w:rPr>
+          <w:bCs/>
+          <w:b/>
+        </w:rPr>
+        <w:t xml:space="preserve">Logging Level</w:t>
+      </w:r>
+      <w:r>
+        <w:t xml:space="preserve">: All events</w:t>
+      </w:r>
+    </w:p>
+    <w:p>
+      <w:pPr>
+        <w:numPr>
+          <w:ilvl w:val="0"/>
+          <w:numId w:val="1016"/>
         </w:numPr>
         <w:pStyle w:val="Compact"/>
       </w:pPr>
@@ -1020,23 +1354,14 @@
         <w:t xml:space="preserve">CORS Enabled</w:t>
       </w:r>
       <w:r>
-        <w:t xml:space="preserve">:</w:t>
-      </w:r>
-      <w:r>
-        <w:t xml:space="preserve"> </w:t>
-      </w:r>
-      <w:r>
-        <w:rPr>
-          <w:rStyle w:val="VerbatimChar"/>
-        </w:rPr>
-        <w:t xml:space="preserve">false</w:t>
+        <w:t xml:space="preserve">: False</w:t>
       </w:r>
     </w:p>
     <w:p>
       <w:pPr>
         <w:numPr>
           <w:ilvl w:val="0"/>
-          <w:numId w:val="1009"/>
+          <w:numId w:val="1016"/>
         </w:numPr>
         <w:pStyle w:val="Compact"/>
       </w:pPr>
@@ -1048,23 +1373,24 @@
         <w:t xml:space="preserve">Return Exception to Sender</w:t>
       </w:r>
       <w:r>
-        <w:t xml:space="preserve">:</w:t>
-      </w:r>
-      <w:r>
-        <w:t xml:space="preserve"> </w:t>
-      </w:r>
-      <w:r>
-        <w:rPr>
-          <w:rStyle w:val="VerbatimChar"/>
-        </w:rPr>
-        <w:t xml:space="preserve">false</w:t>
+        <w:t xml:space="preserve">: False</w:t>
+      </w:r>
+    </w:p>
+    <w:bookmarkEnd w:id="35"/>
+    <w:bookmarkStart w:id="36" w:name="sender-properties"/>
+    <w:p>
+      <w:pPr>
+        <w:pStyle w:val="Heading3"/>
+      </w:pPr>
+      <w:r>
+        <w:t xml:space="preserve">7.2. Sender Properties</w:t>
       </w:r>
     </w:p>
     <w:p>
       <w:pPr>
         <w:numPr>
           <w:ilvl w:val="0"/>
-          <w:numId w:val="1009"/>
+          <w:numId w:val="1017"/>
         </w:numPr>
         <w:pStyle w:val="Compact"/>
       </w:pPr>
@@ -1073,26 +1399,17 @@
           <w:bCs/>
           <w:b/>
         </w:rPr>
-        <w:t xml:space="preserve">HTTP Session Handling</w:t>
-      </w:r>
-      <w:r>
-        <w:t xml:space="preserve">:</w:t>
-      </w:r>
-      <w:r>
-        <w:t xml:space="preserve"> </w:t>
-      </w:r>
-      <w:r>
-        <w:rPr>
-          <w:rStyle w:val="VerbatimChar"/>
-        </w:rPr>
-        <w:t xml:space="preserve">None</w:t>
+        <w:t xml:space="preserve">Enable Basic Authentication</w:t>
+      </w:r>
+      <w:r>
+        <w:t xml:space="preserve">: False</w:t>
       </w:r>
     </w:p>
     <w:p>
       <w:pPr>
         <w:numPr>
           <w:ilvl w:val="0"/>
-          <w:numId w:val="1009"/>
+          <w:numId w:val="1017"/>
         </w:numPr>
         <w:pStyle w:val="Compact"/>
       </w:pPr>
@@ -1101,26 +1418,27 @@
           <w:bCs/>
           <w:b/>
         </w:rPr>
-        <w:t xml:space="preserve">Component Version</w:t>
-      </w:r>
-      <w:r>
-        <w:t xml:space="preserve">:</w:t>
-      </w:r>
-      <w:r>
-        <w:t xml:space="preserve"> </w:t>
-      </w:r>
-      <w:r>
-        <w:rPr>
-          <w:rStyle w:val="VerbatimChar"/>
-        </w:rPr>
-        <w:t xml:space="preserve">1.2</w:t>
+        <w:t xml:space="preserve">Type</w:t>
+      </w:r>
+      <w:r>
+        <w:t xml:space="preserve">: EndpointSender</w:t>
+      </w:r>
+    </w:p>
+    <w:bookmarkEnd w:id="36"/>
+    <w:bookmarkStart w:id="37" w:name="receiver-properties"/>
+    <w:p>
+      <w:pPr>
+        <w:pStyle w:val="Heading3"/>
+      </w:pPr>
+      <w:r>
+        <w:t xml:space="preserve">7.3. Receiver Properties</w:t>
       </w:r>
     </w:p>
     <w:p>
       <w:pPr>
         <w:numPr>
           <w:ilvl w:val="0"/>
-          <w:numId w:val="1009"/>
+          <w:numId w:val="1018"/>
         </w:numPr>
         <w:pStyle w:val="Compact"/>
       </w:pPr>
@@ -1129,126 +1447,69 @@
           <w:bCs/>
           <w:b/>
         </w:rPr>
-        <w:t xml:space="preserve">Access Control</w:t>
-      </w:r>
-      <w:r>
-        <w:t xml:space="preserve">: Various properties related to access control are defined but not utilized.</w:t>
+        <w:t xml:space="preserve">Type</w:t>
+      </w:r>
+      <w:r>
+        <w:t xml:space="preserve">: EndpointReceiver</w:t>
       </w:r>
     </w:p>
-    <w:bookmarkEnd w:id="25"/>
-    <w:bookmarkStart w:id="26" w:name="scheduling"/>
+    <w:bookmarkEnd w:id="37"/>
+    <w:bookmarkEnd w:id="38"/>
+    <w:bookmarkStart w:id="39" w:name="diagram"/>
     <w:p>
       <w:pPr>
-        <w:pStyle w:val="Heading3"/>
-      </w:pPr>
-      <w:r>
-        <w:t xml:space="preserve">Scheduling</w:t>
+        <w:pStyle w:val="Heading2"/>
+      </w:pPr>
+      <w:r>
+        <w:t xml:space="preserve">8. Diagram</w:t>
       </w:r>
     </w:p>
     <w:p>
       <w:pPr>
-        <w:numPr>
-          <w:ilvl w:val="0"/>
-          <w:numId w:val="1010"/>
-        </w:numPr>
-        <w:pStyle w:val="Compact"/>
-      </w:pPr>
-      <w:r>
-        <w:t xml:space="preserve">The integration flow is scheduled to run daily, polling for new emails every minute.</w:t>
+        <w:pStyle w:val="FirstParagraph"/>
+      </w:pPr>
+      <w:r>
+        <w:t xml:space="preserve">The iFlow is visually represented in a BPMN diagram, illustrating the flow of messages and the interactions between different components.</w:t>
       </w:r>
     </w:p>
-    <w:bookmarkEnd w:id="26"/>
-    <w:bookmarkEnd w:id="27"/>
-    <w:bookmarkStart w:id="28" w:name="error-handling"/>
+    <w:bookmarkEnd w:id="39"/>
+    <w:bookmarkStart w:id="40" w:name="conclusion"/>
     <w:p>
       <w:pPr>
         <w:pStyle w:val="Heading2"/>
       </w:pPr>
       <w:r>
-        <w:t xml:space="preserve">Error Handling</w:t>
+        <w:t xml:space="preserve">9. Conclusion</w:t>
       </w:r>
     </w:p>
     <w:p>
       <w:pPr>
-        <w:numPr>
-          <w:ilvl w:val="0"/>
-          <w:numId w:val="1011"/>
-        </w:numPr>
-        <w:pStyle w:val="Compact"/>
-      </w:pPr>
-      <w:r>
-        <w:t xml:space="preserve">The flow is configured to not return exceptions to the sender, which means any errors encountered during processing will not be communicated back to the source.</w:t>
+        <w:pStyle w:val="FirstParagraph"/>
+      </w:pPr>
+      <w:r>
+        <w:t xml:space="preserve">The</w:t>
+      </w:r>
+      <w:r>
+        <w:t xml:space="preserve"> </w:t>
+      </w:r>
+      <w:r>
+        <w:t xml:space="preserve">‘</w:t>
+      </w:r>
+      <w:r>
+        <w:t xml:space="preserve">integrationflow</w:t>
+      </w:r>
+      <w:r>
+        <w:t xml:space="preserve">’</w:t>
+      </w:r>
+      <w:r>
+        <w:t xml:space="preserve"> </w:t>
+      </w:r>
+      <w:r>
+        <w:t xml:space="preserve">iFlow effectively integrates email communication by leveraging IMAP for receiving emails and SMTP for sending emails. The structured approach with defined participants, message flows, and processing activities ensures a robust integration solution.</w:t>
       </w:r>
     </w:p>
-    <w:bookmarkEnd w:id="28"/>
-    <w:bookmarkStart w:id="29" w:name="security"/>
-    <w:p>
-      <w:pPr>
-        <w:pStyle w:val="Heading2"/>
-      </w:pPr>
-      <w:r>
-        <w:t xml:space="preserve">Security</w:t>
-      </w:r>
-    </w:p>
-    <w:p>
-      <w:pPr>
-        <w:numPr>
-          <w:ilvl w:val="0"/>
-          <w:numId w:val="1012"/>
-        </w:numPr>
-        <w:pStyle w:val="Compact"/>
-      </w:pPr>
-      <w:r>
-        <w:t xml:space="preserve">Basic authentication is disabled for the sender.</w:t>
-      </w:r>
-    </w:p>
-    <w:p>
-      <w:pPr>
-        <w:numPr>
-          <w:ilvl w:val="0"/>
-          <w:numId w:val="1012"/>
-        </w:numPr>
-        <w:pStyle w:val="Compact"/>
-      </w:pPr>
-      <w:r>
-        <w:t xml:space="preserve">The flow does not allow credentials to be shared across origins.</w:t>
-      </w:r>
-    </w:p>
-    <w:bookmarkEnd w:id="29"/>
-    <w:bookmarkStart w:id="30" w:name="conclusion"/>
-    <w:p>
-      <w:pPr>
-        <w:pStyle w:val="Heading2"/>
-      </w:pPr>
-      <w:r>
-        <w:t xml:space="preserve">Conclusion</w:t>
-      </w:r>
-    </w:p>
-    <w:p>
-      <w:pPr>
-        <w:pStyle w:val="FirstParagraph"/>
-      </w:pPr>
-      <w:r>
-        <w:t xml:space="preserve">The</w:t>
-      </w:r>
-      <w:r>
-        <w:t xml:space="preserve"> </w:t>
-      </w:r>
-      <w:r>
-        <w:rPr>
-          <w:rStyle w:val="VerbatimChar"/>
-        </w:rPr>
-        <w:t xml:space="preserve">integrationflow</w:t>
-      </w:r>
-      <w:r>
-        <w:t xml:space="preserve"> </w:t>
-      </w:r>
-      <w:r>
-        <w:t xml:space="preserve">is a robust integration solution that leverages email protocols to facilitate data transfer. It includes multiple processing steps to ensure that the data is correctly handled before being sent to the recipient. The flow is designed with error handling and logging capabilities to ensure smooth operation and traceability.</w:t>
-      </w:r>
-    </w:p>
-    <w:bookmarkEnd w:id="30"/>
-    <w:bookmarkEnd w:id="31"/>
+    <w:bookmarkEnd w:id="40"/>
+    <w:bookmarkEnd w:id="41"/>
     <w:sectPr>
       <w:headerReference r:id="rId9" w:type="default"/>
       <w:pgSz w:h="15840" w:w="12240"/>
@@ -1643,82 +1904,6 @@
       </w:pPr>
     </w:lvl>
   </w:abstractNum>
-  <w:abstractNum w:abstractNumId="991">
-    <w:nsid w:val="A991"/>
-    <w:multiLevelType w:val="multilevel"/>
-    <w:lvl w:ilvl="0">
-      <w:numFmt w:val="bullet"/>
-      <w:lvlText w:val="•"/>
-      <w:lvlJc w:val="left"/>
-      <w:pPr>
-        <w:ind w:left="720" w:hanging="480"/>
-      </w:pPr>
-    </w:lvl>
-    <w:lvl w:ilvl="1">
-      <w:numFmt w:val="bullet"/>
-      <w:lvlText w:val="–"/>
-      <w:lvlJc w:val="left"/>
-      <w:pPr>
-        <w:ind w:left="1440" w:hanging="480"/>
-      </w:pPr>
-    </w:lvl>
-    <w:lvl w:ilvl="2">
-      <w:numFmt w:val="bullet"/>
-      <w:lvlText w:val="•"/>
-      <w:lvlJc w:val="left"/>
-      <w:pPr>
-        <w:ind w:left="2160" w:hanging="480"/>
-      </w:pPr>
-    </w:lvl>
-    <w:lvl w:ilvl="3">
-      <w:numFmt w:val="bullet"/>
-      <w:lvlText w:val="–"/>
-      <w:lvlJc w:val="left"/>
-      <w:pPr>
-        <w:ind w:left="2880" w:hanging="480"/>
-      </w:pPr>
-    </w:lvl>
-    <w:lvl w:ilvl="4">
-      <w:numFmt w:val="bullet"/>
-      <w:lvlText w:val="•"/>
-      <w:lvlJc w:val="left"/>
-      <w:pPr>
-        <w:ind w:left="3600" w:hanging="480"/>
-      </w:pPr>
-    </w:lvl>
-    <w:lvl w:ilvl="5">
-      <w:numFmt w:val="bullet"/>
-      <w:lvlText w:val="–"/>
-      <w:lvlJc w:val="left"/>
-      <w:pPr>
-        <w:ind w:left="4320" w:hanging="480"/>
-      </w:pPr>
-    </w:lvl>
-    <w:lvl w:ilvl="6">
-      <w:numFmt w:val="bullet"/>
-      <w:lvlText w:val="•"/>
-      <w:lvlJc w:val="left"/>
-      <w:pPr>
-        <w:ind w:left="5040" w:hanging="480"/>
-      </w:pPr>
-    </w:lvl>
-    <w:lvl w:ilvl="7">
-      <w:numFmt w:val="bullet"/>
-      <w:lvlText w:val="–"/>
-      <w:lvlJc w:val="left"/>
-      <w:pPr>
-        <w:ind w:left="5760" w:hanging="480"/>
-      </w:pPr>
-    </w:lvl>
-    <w:lvl w:ilvl="8">
-      <w:numFmt w:val="bullet"/>
-      <w:lvlText w:val="•"/>
-      <w:lvlJc w:val="left"/>
-      <w:pPr>
-        <w:ind w:left="6480" w:hanging="480"/>
-      </w:pPr>
-    </w:lvl>
-  </w:abstractNum>
   <w:abstractNum w:abstractNumId="99411">
     <w:nsid w:val="A99411"/>
     <w:multiLevelType w:val="multilevel"/>
@@ -1798,6 +1983,82 @@
       <w:start w:val="1"/>
       <w:numFmt w:val="decimal"/>
       <w:lvlText w:val="%9."/>
+      <w:lvlJc w:val="left"/>
+      <w:pPr>
+        <w:ind w:left="6480" w:hanging="480"/>
+      </w:pPr>
+    </w:lvl>
+  </w:abstractNum>
+  <w:abstractNum w:abstractNumId="991">
+    <w:nsid w:val="A991"/>
+    <w:multiLevelType w:val="multilevel"/>
+    <w:lvl w:ilvl="0">
+      <w:numFmt w:val="bullet"/>
+      <w:lvlText w:val="•"/>
+      <w:lvlJc w:val="left"/>
+      <w:pPr>
+        <w:ind w:left="720" w:hanging="480"/>
+      </w:pPr>
+    </w:lvl>
+    <w:lvl w:ilvl="1">
+      <w:numFmt w:val="bullet"/>
+      <w:lvlText w:val="–"/>
+      <w:lvlJc w:val="left"/>
+      <w:pPr>
+        <w:ind w:left="1440" w:hanging="480"/>
+      </w:pPr>
+    </w:lvl>
+    <w:lvl w:ilvl="2">
+      <w:numFmt w:val="bullet"/>
+      <w:lvlText w:val="•"/>
+      <w:lvlJc w:val="left"/>
+      <w:pPr>
+        <w:ind w:left="2160" w:hanging="480"/>
+      </w:pPr>
+    </w:lvl>
+    <w:lvl w:ilvl="3">
+      <w:numFmt w:val="bullet"/>
+      <w:lvlText w:val="–"/>
+      <w:lvlJc w:val="left"/>
+      <w:pPr>
+        <w:ind w:left="2880" w:hanging="480"/>
+      </w:pPr>
+    </w:lvl>
+    <w:lvl w:ilvl="4">
+      <w:numFmt w:val="bullet"/>
+      <w:lvlText w:val="•"/>
+      <w:lvlJc w:val="left"/>
+      <w:pPr>
+        <w:ind w:left="3600" w:hanging="480"/>
+      </w:pPr>
+    </w:lvl>
+    <w:lvl w:ilvl="5">
+      <w:numFmt w:val="bullet"/>
+      <w:lvlText w:val="–"/>
+      <w:lvlJc w:val="left"/>
+      <w:pPr>
+        <w:ind w:left="4320" w:hanging="480"/>
+      </w:pPr>
+    </w:lvl>
+    <w:lvl w:ilvl="6">
+      <w:numFmt w:val="bullet"/>
+      <w:lvlText w:val="•"/>
+      <w:lvlJc w:val="left"/>
+      <w:pPr>
+        <w:ind w:left="5040" w:hanging="480"/>
+      </w:pPr>
+    </w:lvl>
+    <w:lvl w:ilvl="7">
+      <w:numFmt w:val="bullet"/>
+      <w:lvlText w:val="–"/>
+      <w:lvlJc w:val="left"/>
+      <w:pPr>
+        <w:ind w:left="5760" w:hanging="480"/>
+      </w:pPr>
+    </w:lvl>
+    <w:lvl w:ilvl="8">
+      <w:numFmt w:val="bullet"/>
+      <w:lvlText w:val="•"/>
       <w:lvlJc w:val="left"/>
       <w:pPr>
         <w:ind w:left="6480" w:hanging="480"/>
@@ -1835,12 +2096,6 @@
     <w:abstractNumId w:val="990"/>
   </w:num>
   <w:num w:numId="1001">
-    <w:abstractNumId w:val="991"/>
-  </w:num>
-  <w:num w:numId="1002">
-    <w:abstractNumId w:val="991"/>
-  </w:num>
-  <w:num w:numId="1003">
     <w:abstractNumId w:val="99411"/>
     <w:lvlOverride w:ilvl="0">
       <w:startOverride w:val="1"/>
@@ -1870,6 +2125,12 @@
       <w:startOverride w:val="1"/>
     </w:lvlOverride>
   </w:num>
+  <w:num w:numId="1002">
+    <w:abstractNumId w:val="991"/>
+  </w:num>
+  <w:num w:numId="1003">
+    <w:abstractNumId w:val="991"/>
+  </w:num>
   <w:num w:numId="1004">
     <w:abstractNumId w:val="991"/>
   </w:num>
@@ -1880,34 +2141,7 @@
     <w:abstractNumId w:val="991"/>
   </w:num>
   <w:num w:numId="1007">
-    <w:abstractNumId w:val="99411"/>
-    <w:lvlOverride w:ilvl="0">
-      <w:startOverride w:val="1"/>
-    </w:lvlOverride>
-    <w:lvlOverride w:ilvl="1">
-      <w:startOverride w:val="1"/>
-    </w:lvlOverride>
-    <w:lvlOverride w:ilvl="2">
-      <w:startOverride w:val="1"/>
-    </w:lvlOverride>
-    <w:lvlOverride w:ilvl="3">
-      <w:startOverride w:val="1"/>
-    </w:lvlOverride>
-    <w:lvlOverride w:ilvl="4">
-      <w:startOverride w:val="1"/>
-    </w:lvlOverride>
-    <w:lvlOverride w:ilvl="5">
-      <w:startOverride w:val="1"/>
-    </w:lvlOverride>
-    <w:lvlOverride w:ilvl="6">
-      <w:startOverride w:val="1"/>
-    </w:lvlOverride>
-    <w:lvlOverride w:ilvl="7">
-      <w:startOverride w:val="1"/>
-    </w:lvlOverride>
-    <w:lvlOverride w:ilvl="8">
-      <w:startOverride w:val="1"/>
-    </w:lvlOverride>
+    <w:abstractNumId w:val="991"/>
   </w:num>
   <w:num w:numId="1008">
     <w:abstractNumId w:val="991"/>
@@ -1922,6 +2156,24 @@
     <w:abstractNumId w:val="991"/>
   </w:num>
   <w:num w:numId="1012">
+    <w:abstractNumId w:val="991"/>
+  </w:num>
+  <w:num w:numId="1013">
+    <w:abstractNumId w:val="991"/>
+  </w:num>
+  <w:num w:numId="1014">
+    <w:abstractNumId w:val="991"/>
+  </w:num>
+  <w:num w:numId="1015">
+    <w:abstractNumId w:val="991"/>
+  </w:num>
+  <w:num w:numId="1016">
+    <w:abstractNumId w:val="991"/>
+  </w:num>
+  <w:num w:numId="1017">
+    <w:abstractNumId w:val="991"/>
+  </w:num>
+  <w:num w:numId="1018">
     <w:abstractNumId w:val="991"/>
   </w:num>
 </w:numbering>

</xml_diff>

<commit_message>
🤖 DOCS: TOC-driven CPI Technical Specification
</commit_message>
<xml_diff>
--- a/cpi-artifacts/EmailreceiverxlsxToXML/CPI-Mail-Reader_3/src/main/resources/scenarioflows/integrationflow/integrationflow_Technical_Specification.docx
+++ b/cpi-artifacts/EmailreceiverxlsxToXML/CPI-Mail-Reader_3/src/main/resources/scenarioflows/integrationflow/integrationflow_Technical_Specification.docx
@@ -187,42 +187,30 @@
         <w:t xml:space="preserve">Reference Documents</w:t>
       </w:r>
     </w:p>
-    <w:bookmarkStart w:id="41" w:name="documentation-for-iflow-integrationflow"/>
     <w:p>
       <w:pPr>
-        <w:pStyle w:val="Heading1"/>
+        <w:numPr>
+          <w:ilvl w:val="0"/>
+          <w:numId w:val="1002"/>
+        </w:numPr>
+        <w:pStyle w:val="Compact"/>
       </w:pPr>
       <w:r>
-        <w:t xml:space="preserve">Documentation for iFlow</w:t>
+        <w:t xml:space="preserve">Introduction</w:t>
+      </w:r>
+    </w:p>
+    <w:p>
+      <w:pPr>
+        <w:pStyle w:val="FirstParagraph"/>
+      </w:pPr>
+      <w:r>
+        <w:t xml:space="preserve">1.1 Purpose</w:t>
       </w:r>
       <w:r>
         <w:t xml:space="preserve"> </w:t>
       </w:r>
       <w:r>
-        <w:t xml:space="preserve">‘</w:t>
-      </w:r>
-      <w:r>
-        <w:t xml:space="preserve">integrationflow</w:t>
-      </w:r>
-      <w:r>
-        <w:t xml:space="preserve">’</w:t>
-      </w:r>
-    </w:p>
-    <w:bookmarkStart w:id="20" w:name="overview"/>
-    <w:p>
-      <w:pPr>
-        <w:pStyle w:val="Heading2"/>
-      </w:pPr>
-      <w:r>
-        <w:t xml:space="preserve">1. Overview</w:t>
-      </w:r>
-    </w:p>
-    <w:p>
-      <w:pPr>
-        <w:pStyle w:val="FirstParagraph"/>
-      </w:pPr>
-      <w:r>
-        <w:t xml:space="preserve">The iFlow</w:t>
+        <w:t xml:space="preserve">- The purpose of this iFlow, named</w:t>
       </w:r>
       <w:r>
         <w:t xml:space="preserve"> </w:t>
@@ -237,170 +225,151 @@
         <w:t xml:space="preserve">’</w:t>
       </w:r>
       <w:r>
+        <w:t xml:space="preserve">, is to facilitate the integration of email communication by retrieving unread emails from a Gmail account and sending the content as an email attachment to a specified recipient. This process automates the handling of email data, ensuring timely and efficient communication.</w:t>
+      </w:r>
+    </w:p>
+    <w:p>
+      <w:pPr>
+        <w:pStyle w:val="BodyText"/>
+      </w:pPr>
+      <w:r>
+        <w:t xml:space="preserve">1.2 Scope</w:t>
+      </w:r>
+      <w:r>
         <w:t xml:space="preserve"> </w:t>
       </w:r>
       <w:r>
-        <w:t xml:space="preserve">is designed to facilitate the integration of email communication using IMAP and SMTP protocols. It retrieves unread emails from a Gmail account and forwards the content as an attachment to a specified recipient. The iFlow consists of multiple components including a start event, call activities for processing, and message flows for communication between the sender and receiver.</w:t>
-      </w:r>
-    </w:p>
-    <w:bookmarkEnd w:id="20"/>
-    <w:bookmarkStart w:id="21" w:name="iflow-structure"/>
-    <w:p>
-      <w:pPr>
-        <w:pStyle w:val="Heading2"/>
-      </w:pPr>
-      <w:r>
-        <w:t xml:space="preserve">2. iFlow Structure</w:t>
+        <w:t xml:space="preserve">- This iFlow includes the integration of an IMAP email adapter for receiving emails and an SMTP email adapter for sending emails. The integration boundaries are defined between the sender (Gmail) and the receiver (specified email address). The iFlow does not include any external systems beyond the email services.</w:t>
       </w:r>
     </w:p>
     <w:p>
       <w:pPr>
-        <w:pStyle w:val="FirstParagraph"/>
+        <w:numPr>
+          <w:ilvl w:val="0"/>
+          <w:numId w:val="1003"/>
+        </w:numPr>
+        <w:pStyle w:val="Compact"/>
       </w:pPr>
       <w:r>
-        <w:t xml:space="preserve">The iFlow is structured as follows:</w:t>
+        <w:t xml:space="preserve">Integration Overview</w:t>
       </w:r>
     </w:p>
     <w:p>
       <w:pPr>
-        <w:numPr>
-          <w:ilvl w:val="0"/>
-          <w:numId w:val="1002"/>
-        </w:numPr>
-        <w:pStyle w:val="Compact"/>
+        <w:pStyle w:val="FirstParagraph"/>
       </w:pPr>
       <w:r>
-        <w:rPr>
-          <w:bCs/>
-          <w:b/>
-        </w:rPr>
-        <w:t xml:space="preserve">Start Event</w:t>
+        <w:t xml:space="preserve">2.1 Integration Architecture</w:t>
       </w:r>
       <w:r>
-        <w:t xml:space="preserve">: Initiates the flow.</w:t>
+        <w:t xml:space="preserve"> </w:t>
+      </w:r>
+      <w:r>
+        <w:t xml:space="preserve">- The integration architecture consists of a sender participant that connects to the Gmail IMAP server to fetch unread emails, processes the email content through a series of activities (including Groovy scripts and content modifiers), and finally sends the processed content as an email attachment to a designated recipient via the SMTP server.</w:t>
       </w:r>
     </w:p>
     <w:p>
       <w:pPr>
-        <w:numPr>
-          <w:ilvl w:val="0"/>
-          <w:numId w:val="1002"/>
-        </w:numPr>
-        <w:pStyle w:val="Compact"/>
+        <w:pStyle w:val="BodyText"/>
       </w:pPr>
       <w:r>
-        <w:rPr>
-          <w:bCs/>
-          <w:b/>
-        </w:rPr>
-        <w:t xml:space="preserve">Call Activities</w:t>
+        <w:t xml:space="preserve">2.2 Integration Components</w:t>
       </w:r>
       <w:r>
-        <w:t xml:space="preserve">:</w:t>
+        <w:t xml:space="preserve"> </w:t>
+      </w:r>
+      <w:r>
+        <w:t xml:space="preserve">- Adapters:</w:t>
+      </w:r>
+      <w:r>
+        <w:t xml:space="preserve"> </w:t>
+      </w:r>
+      <w:r>
+        <w:t xml:space="preserve">- IMAP Adapter: Used to retrieve unread emails from the Gmail account.</w:t>
+      </w:r>
+      <w:r>
+        <w:t xml:space="preserve"> </w:t>
+      </w:r>
+      <w:r>
+        <w:t xml:space="preserve">- SMTP Adapter: Used to send emails with the processed content as an attachment.</w:t>
+      </w:r>
+      <w:r>
+        <w:t xml:space="preserve"> </w:t>
+      </w:r>
+      <w:r>
+        <w:t xml:space="preserve">- Scripts:</w:t>
+      </w:r>
+      <w:r>
+        <w:t xml:space="preserve"> </w:t>
+      </w:r>
+      <w:r>
+        <w:t xml:space="preserve">- Groovy Script: A script activity that processes the email content.</w:t>
+      </w:r>
+      <w:r>
+        <w:t xml:space="preserve"> </w:t>
+      </w:r>
+      <w:r>
+        <w:t xml:space="preserve">- Content Modifiers:</w:t>
+      </w:r>
+      <w:r>
+        <w:t xml:space="preserve"> </w:t>
+      </w:r>
+      <w:r>
+        <w:t xml:space="preserve">- Content Modifier 1 and Content Modifier 2: Activities that enrich the message content before sending.</w:t>
       </w:r>
     </w:p>
     <w:p>
       <w:pPr>
         <w:numPr>
-          <w:ilvl w:val="1"/>
-          <w:numId w:val="1003"/>
+          <w:ilvl w:val="0"/>
+          <w:numId w:val="1004"/>
         </w:numPr>
         <w:pStyle w:val="Compact"/>
       </w:pPr>
       <w:r>
-        <w:t xml:space="preserve">Groovy Script for processing.</w:t>
+        <w:t xml:space="preserve">Integration Scenarios</w:t>
       </w:r>
     </w:p>
     <w:p>
       <w:pPr>
-        <w:numPr>
-          <w:ilvl w:val="1"/>
-          <w:numId w:val="1003"/>
-        </w:numPr>
-        <w:pStyle w:val="Compact"/>
+        <w:pStyle w:val="FirstParagraph"/>
       </w:pPr>
       <w:r>
-        <w:t xml:space="preserve">Content Modifiers for enriching the message.</w:t>
+        <w:t xml:space="preserve">3.1 Scenario Description</w:t>
+      </w:r>
+      <w:r>
+        <w:t xml:space="preserve"> </w:t>
+      </w:r>
+      <w:r>
+        <w:t xml:space="preserve">- The integration flow begins with the Start Event, which triggers the retrieval of unread emails from the Gmail account using the IMAP adapter. The emails are processed through a Groovy script to extract relevant information. The processed data is then modified using two content modifiers to prepare it for sending. Finally, the End Event signifies the completion of the process after the email is sent to the specified recipient.</w:t>
       </w:r>
     </w:p>
     <w:p>
       <w:pPr>
-        <w:numPr>
-          <w:ilvl w:val="0"/>
-          <w:numId w:val="1002"/>
-        </w:numPr>
-        <w:pStyle w:val="Compact"/>
+        <w:pStyle w:val="BodyText"/>
       </w:pPr>
       <w:r>
-        <w:rPr>
-          <w:bCs/>
-          <w:b/>
-        </w:rPr>
-        <w:t xml:space="preserve">End Event</w:t>
+        <w:t xml:space="preserve">3.2 Data Flows</w:t>
       </w:r>
       <w:r>
-        <w:t xml:space="preserve">: Marks the completion of the flow.</w:t>
+        <w:t xml:space="preserve"> </w:t>
+      </w:r>
+      <w:r>
+        <w:t xml:space="preserve">- The message flow starts with the IMAP adapter fetching unread emails from the Gmail inbox. The email content is transformed and enriched using the Groovy script and content modifiers. The final output is routed to the SMTP adapter, which sends the email to the designated recipient.</w:t>
       </w:r>
     </w:p>
     <w:p>
       <w:pPr>
-        <w:numPr>
-          <w:ilvl w:val="0"/>
-          <w:numId w:val="1002"/>
-        </w:numPr>
-        <w:pStyle w:val="Compact"/>
+        <w:pStyle w:val="BodyText"/>
       </w:pPr>
       <w:r>
-        <w:rPr>
-          <w:bCs/>
-          <w:b/>
-        </w:rPr>
-        <w:t xml:space="preserve">Message Flows</w:t>
+        <w:t xml:space="preserve">3.3 Security Requirements</w:t>
       </w:r>
       <w:r>
-        <w:t xml:space="preserve">:</w:t>
+        <w:t xml:space="preserve"> </w:t>
       </w:r>
-    </w:p>
-    <w:p>
-      <w:pPr>
-        <w:numPr>
-          <w:ilvl w:val="1"/>
-          <w:numId w:val="1004"/>
-        </w:numPr>
-        <w:pStyle w:val="Compact"/>
-      </w:pPr>
       <w:r>
-        <w:t xml:space="preserve">From the sender (IMAP) to the start event.</w:t>
-      </w:r>
-    </w:p>
-    <w:p>
-      <w:pPr>
-        <w:numPr>
-          <w:ilvl w:val="1"/>
-          <w:numId w:val="1004"/>
-        </w:numPr>
-        <w:pStyle w:val="Compact"/>
-      </w:pPr>
-      <w:r>
-        <w:t xml:space="preserve">From the end event to the receiver (SMTP).</w:t>
-      </w:r>
-    </w:p>
-    <w:bookmarkEnd w:id="21"/>
-    <w:bookmarkStart w:id="22" w:name="participants"/>
-    <w:p>
-      <w:pPr>
-        <w:pStyle w:val="Heading2"/>
-      </w:pPr>
-      <w:r>
-        <w:t xml:space="preserve">3. Participants</w:t>
-      </w:r>
-    </w:p>
-    <w:p>
-      <w:pPr>
-        <w:pStyle w:val="FirstParagraph"/>
-      </w:pPr>
-      <w:r>
-        <w:t xml:space="preserve">The iFlow includes the following participants:</w:t>
+        <w:t xml:space="preserve">- The integration requires basic authentication for both the IMAP and SMTP adapters. Credentials for accessing the Gmail account are specified within the iFlow. No additional authorization mechanisms are implemented.</w:t>
       </w:r>
     </w:p>
     <w:p>
@@ -412,71 +381,7 @@
         <w:pStyle w:val="Compact"/>
       </w:pPr>
       <w:r>
-        <w:rPr>
-          <w:bCs/>
-          <w:b/>
-        </w:rPr>
-        <w:t xml:space="preserve">Sender</w:t>
-      </w:r>
-      <w:r>
-        <w:t xml:space="preserve">: Represents the source of the email (IMAP).</w:t>
-      </w:r>
-    </w:p>
-    <w:p>
-      <w:pPr>
-        <w:numPr>
-          <w:ilvl w:val="0"/>
-          <w:numId w:val="1005"/>
-        </w:numPr>
-        <w:pStyle w:val="Compact"/>
-      </w:pPr>
-      <w:r>
-        <w:rPr>
-          <w:bCs/>
-          <w:b/>
-        </w:rPr>
-        <w:t xml:space="preserve">Receiver</w:t>
-      </w:r>
-      <w:r>
-        <w:t xml:space="preserve">: Represents the destination for the email (SMTP).</w:t>
-      </w:r>
-    </w:p>
-    <w:p>
-      <w:pPr>
-        <w:numPr>
-          <w:ilvl w:val="0"/>
-          <w:numId w:val="1005"/>
-        </w:numPr>
-        <w:pStyle w:val="Compact"/>
-      </w:pPr>
-      <w:r>
-        <w:rPr>
-          <w:bCs/>
-          <w:b/>
-        </w:rPr>
-        <w:t xml:space="preserve">Integration Process</w:t>
-      </w:r>
-      <w:r>
-        <w:t xml:space="preserve">: The main processing logic of the iFlow.</w:t>
-      </w:r>
-    </w:p>
-    <w:bookmarkEnd w:id="22"/>
-    <w:bookmarkStart w:id="25" w:name="message-flows"/>
-    <w:p>
-      <w:pPr>
-        <w:pStyle w:val="Heading2"/>
-      </w:pPr>
-      <w:r>
-        <w:t xml:space="preserve">4. Message Flows</w:t>
-      </w:r>
-    </w:p>
-    <w:bookmarkStart w:id="23" w:name="message-flow-from-sender-to-start-event"/>
-    <w:p>
-      <w:pPr>
-        <w:pStyle w:val="Heading3"/>
-      </w:pPr>
-      <w:r>
-        <w:t xml:space="preserve">4.1. Message Flow from Sender to Start Event</w:t>
+        <w:t xml:space="preserve">Error Handling and Logging</w:t>
       </w:r>
     </w:p>
     <w:p>
@@ -488,179 +393,59 @@
         <w:pStyle w:val="Compact"/>
       </w:pPr>
       <w:r>
-        <w:rPr>
-          <w:bCs/>
-          <w:b/>
-        </w:rPr>
-        <w:t xml:space="preserve">Source</w:t>
-      </w:r>
-      <w:r>
-        <w:t xml:space="preserve">: Participant_1 (Sender)</w:t>
+        <w:t xml:space="preserve">The iFlow implements a logging strategy that captures all events, allowing for comprehensive monitoring of the integration process. Error handling is managed by returning exceptions to the sender, ensuring that any issues encountered during processing are logged for further analysis.</w:t>
       </w:r>
     </w:p>
     <w:p>
       <w:pPr>
         <w:numPr>
           <w:ilvl w:val="0"/>
-          <w:numId w:val="1006"/>
-        </w:numPr>
-        <w:pStyle w:val="Compact"/>
-      </w:pPr>
-      <w:r>
-        <w:rPr>
-          <w:bCs/>
-          <w:b/>
-        </w:rPr>
-        <w:t xml:space="preserve">Target</w:t>
-      </w:r>
-      <w:r>
-        <w:t xml:space="preserve">: StartEvent_2</w:t>
-      </w:r>
-    </w:p>
-    <w:p>
-      <w:pPr>
-        <w:numPr>
-          <w:ilvl w:val="0"/>
-          <w:numId w:val="1006"/>
-        </w:numPr>
-        <w:pStyle w:val="Compact"/>
-      </w:pPr>
-      <w:r>
-        <w:rPr>
-          <w:bCs/>
-          <w:b/>
-        </w:rPr>
-        <w:t xml:space="preserve">Properties</w:t>
-      </w:r>
-      <w:r>
-        <w:t xml:space="preserve">:</w:t>
-      </w:r>
-    </w:p>
-    <w:p>
-      <w:pPr>
-        <w:numPr>
-          <w:ilvl w:val="1"/>
           <w:numId w:val="1007"/>
         </w:numPr>
-        <w:pStyle w:val="Compact"/>
       </w:pPr>
       <w:r>
-        <w:t xml:space="preserve">Server:</w:t>
+        <w:t xml:space="preserve">Testing Validation</w:t>
       </w:r>
       <w:r>
         <w:t xml:space="preserve"> </w:t>
       </w:r>
       <w:r>
-        <w:rPr>
-          <w:rStyle w:val="VerbatimChar"/>
-        </w:rPr>
-        <w:t xml:space="preserve">imap.gmail.com:993</w:t>
-      </w:r>
-    </w:p>
-    <w:p>
-      <w:pPr>
-        <w:numPr>
-          <w:ilvl w:val="1"/>
-          <w:numId w:val="1007"/>
-        </w:numPr>
-        <w:pStyle w:val="Compact"/>
-      </w:pPr>
-      <w:r>
-        <w:t xml:space="preserve">Authentication:</w:t>
+        <w:t xml:space="preserve">| Test Case ID | Scenario | Expected Outcome |</w:t>
       </w:r>
       <w:r>
         <w:t xml:space="preserve"> </w:t>
       </w:r>
       <w:r>
-        <w:rPr>
-          <w:rStyle w:val="VerbatimChar"/>
-        </w:rPr>
-        <w:t xml:space="preserve">loginPlain</w:t>
-      </w:r>
-    </w:p>
-    <w:p>
-      <w:pPr>
-        <w:numPr>
-          <w:ilvl w:val="1"/>
-          <w:numId w:val="1007"/>
-        </w:numPr>
-        <w:pStyle w:val="Compact"/>
-      </w:pPr>
-      <w:r>
-        <w:t xml:space="preserve">SSL:</w:t>
+        <w:t xml:space="preserve">|—————|———————————–|—————————————————|</w:t>
       </w:r>
       <w:r>
         <w:t xml:space="preserve"> </w:t>
       </w:r>
       <w:r>
-        <w:rPr>
-          <w:rStyle w:val="VerbatimChar"/>
-        </w:rPr>
-        <w:t xml:space="preserve">imaps</w:t>
-      </w:r>
-    </w:p>
-    <w:p>
-      <w:pPr>
-        <w:numPr>
-          <w:ilvl w:val="1"/>
-          <w:numId w:val="1007"/>
-        </w:numPr>
-        <w:pStyle w:val="Compact"/>
-      </w:pPr>
-      <w:r>
-        <w:t xml:space="preserve">Max Messages Per Poll:</w:t>
+        <w:t xml:space="preserve">| TC_01 | Fetch unread emails | Unread emails are successfully retrieved from Gmail. |</w:t>
       </w:r>
       <w:r>
         <w:t xml:space="preserve"> </w:t>
       </w:r>
       <w:r>
-        <w:rPr>
-          <w:rStyle w:val="VerbatimChar"/>
-        </w:rPr>
-        <w:t xml:space="preserve">20</w:t>
-      </w:r>
-    </w:p>
-    <w:p>
-      <w:pPr>
-        <w:numPr>
-          <w:ilvl w:val="1"/>
-          <w:numId w:val="1007"/>
-        </w:numPr>
-        <w:pStyle w:val="Compact"/>
-      </w:pPr>
-      <w:r>
-        <w:t xml:space="preserve">Folder:</w:t>
+        <w:t xml:space="preserve">| TC_02 | Process email content | Email content is processed and transformed correctly. |</w:t>
       </w:r>
       <w:r>
         <w:t xml:space="preserve"> </w:t>
       </w:r>
       <w:r>
-        <w:rPr>
-          <w:rStyle w:val="VerbatimChar"/>
-        </w:rPr>
-        <w:t xml:space="preserve">INBOX</w:t>
+        <w:t xml:space="preserve">| TC_03 | Send email with attachment | Email is sent successfully to the specified recipient with the correct attachment. |</w:t>
       </w:r>
     </w:p>
     <w:p>
       <w:pPr>
         <w:numPr>
-          <w:ilvl w:val="1"/>
+          <w:ilvl w:val="0"/>
           <w:numId w:val="1007"/>
         </w:numPr>
-        <w:pStyle w:val="Compact"/>
       </w:pPr>
       <w:r>
-        <w:t xml:space="preserve">Schedule Key: Configured for daily polling.</w:t>
-      </w:r>
-    </w:p>
-    <w:bookmarkEnd w:id="23"/>
-    <w:bookmarkStart w:id="24" w:name="message-flow-from-end-event-to-receiver"/>
-    <w:p>
-      <w:pPr>
-        <w:pStyle w:val="Heading3"/>
-      </w:pPr>
-      <w:r>
-        <w:t xml:space="preserve">4.2. Message Flow from End Event to Receiver</w:t>
+        <w:t xml:space="preserve">Reference Documents</w:t>
       </w:r>
     </w:p>
     <w:p>
@@ -672,14 +457,7 @@
         <w:pStyle w:val="Compact"/>
       </w:pPr>
       <w:r>
-        <w:rPr>
-          <w:bCs/>
-          <w:b/>
-        </w:rPr>
-        <w:t xml:space="preserve">Source</w:t>
-      </w:r>
-      <w:r>
-        <w:t xml:space="preserve">: EndEvent_2</w:t>
+        <w:t xml:space="preserve">CPI Package: integrationflow</w:t>
       </w:r>
     </w:p>
     <w:p>
@@ -691,14 +469,7 @@
         <w:pStyle w:val="Compact"/>
       </w:pPr>
       <w:r>
-        <w:rPr>
-          <w:bCs/>
-          <w:b/>
-        </w:rPr>
-        <w:t xml:space="preserve">Target</w:t>
-      </w:r>
-      <w:r>
-        <w:t xml:space="preserve">: Participant_2 (Receiver)</w:t>
+        <w:t xml:space="preserve">iFlow Name: integrationflow</w:t>
       </w:r>
     </w:p>
     <w:p>
@@ -710,806 +481,9 @@
         <w:pStyle w:val="Compact"/>
       </w:pPr>
       <w:r>
-        <w:rPr>
-          <w:bCs/>
-          <w:b/>
-        </w:rPr>
-        <w:t xml:space="preserve">Properties</w:t>
-      </w:r>
-      <w:r>
-        <w:t xml:space="preserve">:</w:t>
+        <w:t xml:space="preserve">Related References: IMAP and SMTP adapter documentation, Groovy script documentation.</w:t>
       </w:r>
     </w:p>
-    <w:p>
-      <w:pPr>
-        <w:numPr>
-          <w:ilvl w:val="1"/>
-          <w:numId w:val="1009"/>
-        </w:numPr>
-        <w:pStyle w:val="Compact"/>
-      </w:pPr>
-      <w:r>
-        <w:t xml:space="preserve">Server:</w:t>
-      </w:r>
-      <w:r>
-        <w:t xml:space="preserve"> </w:t>
-      </w:r>
-      <w:r>
-        <w:rPr>
-          <w:rStyle w:val="VerbatimChar"/>
-        </w:rPr>
-        <w:t xml:space="preserve">smtp.gmail.com</w:t>
-      </w:r>
-    </w:p>
-    <w:p>
-      <w:pPr>
-        <w:numPr>
-          <w:ilvl w:val="1"/>
-          <w:numId w:val="1009"/>
-        </w:numPr>
-        <w:pStyle w:val="Compact"/>
-      </w:pPr>
-      <w:r>
-        <w:t xml:space="preserve">Authentication:</w:t>
-      </w:r>
-      <w:r>
-        <w:t xml:space="preserve"> </w:t>
-      </w:r>
-      <w:r>
-        <w:rPr>
-          <w:rStyle w:val="VerbatimChar"/>
-        </w:rPr>
-        <w:t xml:space="preserve">loginPlain</w:t>
-      </w:r>
-    </w:p>
-    <w:p>
-      <w:pPr>
-        <w:numPr>
-          <w:ilvl w:val="1"/>
-          <w:numId w:val="1009"/>
-        </w:numPr>
-        <w:pStyle w:val="Compact"/>
-      </w:pPr>
-      <w:r>
-        <w:t xml:space="preserve">Subject:</w:t>
-      </w:r>
-      <w:r>
-        <w:t xml:space="preserve"> </w:t>
-      </w:r>
-      <w:r>
-        <w:rPr>
-          <w:rStyle w:val="VerbatimChar"/>
-        </w:rPr>
-        <w:t xml:space="preserve">XML DATA</w:t>
-      </w:r>
-    </w:p>
-    <w:p>
-      <w:pPr>
-        <w:numPr>
-          <w:ilvl w:val="1"/>
-          <w:numId w:val="1009"/>
-        </w:numPr>
-        <w:pStyle w:val="Compact"/>
-      </w:pPr>
-      <w:r>
-        <w:t xml:space="preserve">From:</w:t>
-      </w:r>
-      <w:r>
-        <w:t xml:space="preserve"> </w:t>
-      </w:r>
-      <w:r>
-        <w:rPr>
-          <w:rStyle w:val="VerbatimChar"/>
-        </w:rPr>
-        <w:t xml:space="preserve">sindhukv898@gmail.com</w:t>
-      </w:r>
-    </w:p>
-    <w:p>
-      <w:pPr>
-        <w:numPr>
-          <w:ilvl w:val="1"/>
-          <w:numId w:val="1009"/>
-        </w:numPr>
-        <w:pStyle w:val="Compact"/>
-      </w:pPr>
-      <w:r>
-        <w:t xml:space="preserve">To:</w:t>
-      </w:r>
-      <w:r>
-        <w:t xml:space="preserve"> </w:t>
-      </w:r>
-      <w:r>
-        <w:rPr>
-          <w:rStyle w:val="VerbatimChar"/>
-        </w:rPr>
-        <w:t xml:space="preserve">sindhu.kv@motiveminds.com</w:t>
-      </w:r>
-    </w:p>
-    <w:p>
-      <w:pPr>
-        <w:numPr>
-          <w:ilvl w:val="1"/>
-          <w:numId w:val="1009"/>
-        </w:numPr>
-        <w:pStyle w:val="Compact"/>
-      </w:pPr>
-      <w:r>
-        <w:t xml:space="preserve">Content Type:</w:t>
-      </w:r>
-      <w:r>
-        <w:t xml:space="preserve"> </w:t>
-      </w:r>
-      <w:r>
-        <w:rPr>
-          <w:rStyle w:val="VerbatimChar"/>
-        </w:rPr>
-        <w:t xml:space="preserve">text/plain</w:t>
-      </w:r>
-    </w:p>
-    <w:p>
-      <w:pPr>
-        <w:numPr>
-          <w:ilvl w:val="1"/>
-          <w:numId w:val="1009"/>
-        </w:numPr>
-        <w:pStyle w:val="Compact"/>
-      </w:pPr>
-      <w:r>
-        <w:t xml:space="preserve">Attachments: XML data as an attachment.</w:t>
-      </w:r>
-    </w:p>
-    <w:bookmarkEnd w:id="24"/>
-    <w:bookmarkEnd w:id="25"/>
-    <w:bookmarkStart w:id="31" w:name="process-details"/>
-    <w:p>
-      <w:pPr>
-        <w:pStyle w:val="Heading2"/>
-      </w:pPr>
-      <w:r>
-        <w:t xml:space="preserve">5. Process Details</w:t>
-      </w:r>
-    </w:p>
-    <w:bookmarkStart w:id="26" w:name="integration-process"/>
-    <w:p>
-      <w:pPr>
-        <w:pStyle w:val="Heading3"/>
-      </w:pPr>
-      <w:r>
-        <w:t xml:space="preserve">5.1. Integration Process</w:t>
-      </w:r>
-    </w:p>
-    <w:p>
-      <w:pPr>
-        <w:numPr>
-          <w:ilvl w:val="0"/>
-          <w:numId w:val="1010"/>
-        </w:numPr>
-        <w:pStyle w:val="Compact"/>
-      </w:pPr>
-      <w:r>
-        <w:rPr>
-          <w:bCs/>
-          <w:b/>
-        </w:rPr>
-        <w:t xml:space="preserve">ID</w:t>
-      </w:r>
-      <w:r>
-        <w:t xml:space="preserve">: Process_1</w:t>
-      </w:r>
-    </w:p>
-    <w:p>
-      <w:pPr>
-        <w:numPr>
-          <w:ilvl w:val="0"/>
-          <w:numId w:val="1010"/>
-        </w:numPr>
-        <w:pStyle w:val="Compact"/>
-      </w:pPr>
-      <w:r>
-        <w:rPr>
-          <w:bCs/>
-          <w:b/>
-        </w:rPr>
-        <w:t xml:space="preserve">Transaction Timeout</w:t>
-      </w:r>
-      <w:r>
-        <w:t xml:space="preserve">: 30 seconds</w:t>
-      </w:r>
-    </w:p>
-    <w:p>
-      <w:pPr>
-        <w:numPr>
-          <w:ilvl w:val="0"/>
-          <w:numId w:val="1010"/>
-        </w:numPr>
-        <w:pStyle w:val="Compact"/>
-      </w:pPr>
-      <w:r>
-        <w:rPr>
-          <w:bCs/>
-          <w:b/>
-        </w:rPr>
-        <w:t xml:space="preserve">Transactional Handling</w:t>
-      </w:r>
-      <w:r>
-        <w:t xml:space="preserve">: Not Required</w:t>
-      </w:r>
-    </w:p>
-    <w:bookmarkEnd w:id="26"/>
-    <w:bookmarkStart w:id="30" w:name="call-activities"/>
-    <w:p>
-      <w:pPr>
-        <w:pStyle w:val="Heading3"/>
-      </w:pPr>
-      <w:r>
-        <w:t xml:space="preserve">5.2. Call Activities</w:t>
-      </w:r>
-    </w:p>
-    <w:bookmarkStart w:id="27" w:name="groovy-script-1"/>
-    <w:p>
-      <w:pPr>
-        <w:pStyle w:val="Heading4"/>
-      </w:pPr>
-      <w:r>
-        <w:t xml:space="preserve">5.2.1. Groovy Script 1</w:t>
-      </w:r>
-    </w:p>
-    <w:p>
-      <w:pPr>
-        <w:numPr>
-          <w:ilvl w:val="0"/>
-          <w:numId w:val="1011"/>
-        </w:numPr>
-        <w:pStyle w:val="Compact"/>
-      </w:pPr>
-      <w:r>
-        <w:rPr>
-          <w:bCs/>
-          <w:b/>
-        </w:rPr>
-        <w:t xml:space="preserve">ID</w:t>
-      </w:r>
-      <w:r>
-        <w:t xml:space="preserve">: CallActivity_33462155</w:t>
-      </w:r>
-    </w:p>
-    <w:p>
-      <w:pPr>
-        <w:numPr>
-          <w:ilvl w:val="0"/>
-          <w:numId w:val="1011"/>
-        </w:numPr>
-        <w:pStyle w:val="Compact"/>
-      </w:pPr>
-      <w:r>
-        <w:rPr>
-          <w:bCs/>
-          <w:b/>
-        </w:rPr>
-        <w:t xml:space="preserve">Script</w:t>
-      </w:r>
-      <w:r>
-        <w:t xml:space="preserve">:</w:t>
-      </w:r>
-      <w:r>
-        <w:t xml:space="preserve"> </w:t>
-      </w:r>
-      <w:r>
-        <w:rPr>
-          <w:rStyle w:val="VerbatimChar"/>
-        </w:rPr>
-        <w:t xml:space="preserve">script1.groovy</w:t>
-      </w:r>
-    </w:p>
-    <w:p>
-      <w:pPr>
-        <w:numPr>
-          <w:ilvl w:val="0"/>
-          <w:numId w:val="1011"/>
-        </w:numPr>
-        <w:pStyle w:val="Compact"/>
-      </w:pPr>
-      <w:r>
-        <w:rPr>
-          <w:bCs/>
-          <w:b/>
-        </w:rPr>
-        <w:t xml:space="preserve">Component Version</w:t>
-      </w:r>
-      <w:r>
-        <w:t xml:space="preserve">: 1.1</w:t>
-      </w:r>
-    </w:p>
-    <w:bookmarkEnd w:id="27"/>
-    <w:bookmarkStart w:id="28" w:name="content-modifier-1"/>
-    <w:p>
-      <w:pPr>
-        <w:pStyle w:val="Heading4"/>
-      </w:pPr>
-      <w:r>
-        <w:t xml:space="preserve">5.2.2. Content Modifier 1</w:t>
-      </w:r>
-    </w:p>
-    <w:p>
-      <w:pPr>
-        <w:numPr>
-          <w:ilvl w:val="0"/>
-          <w:numId w:val="1012"/>
-        </w:numPr>
-        <w:pStyle w:val="Compact"/>
-      </w:pPr>
-      <w:r>
-        <w:rPr>
-          <w:bCs/>
-          <w:b/>
-        </w:rPr>
-        <w:t xml:space="preserve">ID</w:t>
-      </w:r>
-      <w:r>
-        <w:t xml:space="preserve">: CallActivity_33462159</w:t>
-      </w:r>
-    </w:p>
-    <w:p>
-      <w:pPr>
-        <w:numPr>
-          <w:ilvl w:val="0"/>
-          <w:numId w:val="1012"/>
-        </w:numPr>
-        <w:pStyle w:val="Compact"/>
-      </w:pPr>
-      <w:r>
-        <w:rPr>
-          <w:bCs/>
-          <w:b/>
-        </w:rPr>
-        <w:t xml:space="preserve">Body Type</w:t>
-      </w:r>
-      <w:r>
-        <w:t xml:space="preserve">: Constant</w:t>
-      </w:r>
-    </w:p>
-    <w:p>
-      <w:pPr>
-        <w:numPr>
-          <w:ilvl w:val="0"/>
-          <w:numId w:val="1012"/>
-        </w:numPr>
-        <w:pStyle w:val="Compact"/>
-      </w:pPr>
-      <w:r>
-        <w:rPr>
-          <w:bCs/>
-          <w:b/>
-        </w:rPr>
-        <w:t xml:space="preserve">Component Version</w:t>
-      </w:r>
-      <w:r>
-        <w:t xml:space="preserve">: 1.6</w:t>
-      </w:r>
-    </w:p>
-    <w:bookmarkEnd w:id="28"/>
-    <w:bookmarkStart w:id="29" w:name="content-modifier-2"/>
-    <w:p>
-      <w:pPr>
-        <w:pStyle w:val="Heading4"/>
-      </w:pPr>
-      <w:r>
-        <w:t xml:space="preserve">5.2.3. Content Modifier 2</w:t>
-      </w:r>
-    </w:p>
-    <w:p>
-      <w:pPr>
-        <w:numPr>
-          <w:ilvl w:val="0"/>
-          <w:numId w:val="1013"/>
-        </w:numPr>
-        <w:pStyle w:val="Compact"/>
-      </w:pPr>
-      <w:r>
-        <w:rPr>
-          <w:bCs/>
-          <w:b/>
-        </w:rPr>
-        <w:t xml:space="preserve">ID</w:t>
-      </w:r>
-      <w:r>
-        <w:t xml:space="preserve">: CallActivity_33462160</w:t>
-      </w:r>
-    </w:p>
-    <w:p>
-      <w:pPr>
-        <w:numPr>
-          <w:ilvl w:val="0"/>
-          <w:numId w:val="1013"/>
-        </w:numPr>
-        <w:pStyle w:val="Compact"/>
-      </w:pPr>
-      <w:r>
-        <w:rPr>
-          <w:bCs/>
-          <w:b/>
-        </w:rPr>
-        <w:t xml:space="preserve">Body Type</w:t>
-      </w:r>
-      <w:r>
-        <w:t xml:space="preserve">: Constant</w:t>
-      </w:r>
-    </w:p>
-    <w:p>
-      <w:pPr>
-        <w:numPr>
-          <w:ilvl w:val="0"/>
-          <w:numId w:val="1013"/>
-        </w:numPr>
-        <w:pStyle w:val="Compact"/>
-      </w:pPr>
-      <w:r>
-        <w:rPr>
-          <w:bCs/>
-          <w:b/>
-        </w:rPr>
-        <w:t xml:space="preserve">Component Version</w:t>
-      </w:r>
-      <w:r>
-        <w:t xml:space="preserve">: 1.6</w:t>
-      </w:r>
-    </w:p>
-    <w:bookmarkEnd w:id="29"/>
-    <w:bookmarkEnd w:id="30"/>
-    <w:bookmarkEnd w:id="31"/>
-    <w:bookmarkStart w:id="34" w:name="events"/>
-    <w:p>
-      <w:pPr>
-        <w:pStyle w:val="Heading2"/>
-      </w:pPr>
-      <w:r>
-        <w:t xml:space="preserve">6. Events</w:t>
-      </w:r>
-    </w:p>
-    <w:bookmarkStart w:id="32" w:name="start-event"/>
-    <w:p>
-      <w:pPr>
-        <w:pStyle w:val="Heading3"/>
-      </w:pPr>
-      <w:r>
-        <w:t xml:space="preserve">6.1. Start Event</w:t>
-      </w:r>
-    </w:p>
-    <w:p>
-      <w:pPr>
-        <w:numPr>
-          <w:ilvl w:val="0"/>
-          <w:numId w:val="1014"/>
-        </w:numPr>
-        <w:pStyle w:val="Compact"/>
-      </w:pPr>
-      <w:r>
-        <w:rPr>
-          <w:bCs/>
-          <w:b/>
-        </w:rPr>
-        <w:t xml:space="preserve">ID</w:t>
-      </w:r>
-      <w:r>
-        <w:t xml:space="preserve">: StartEvent_2</w:t>
-      </w:r>
-    </w:p>
-    <w:p>
-      <w:pPr>
-        <w:numPr>
-          <w:ilvl w:val="0"/>
-          <w:numId w:val="1014"/>
-        </w:numPr>
-        <w:pStyle w:val="Compact"/>
-      </w:pPr>
-      <w:r>
-        <w:rPr>
-          <w:bCs/>
-          <w:b/>
-        </w:rPr>
-        <w:t xml:space="preserve">Component Version</w:t>
-      </w:r>
-      <w:r>
-        <w:t xml:space="preserve">: 1.0</w:t>
-      </w:r>
-    </w:p>
-    <w:bookmarkEnd w:id="32"/>
-    <w:bookmarkStart w:id="33" w:name="end-event"/>
-    <w:p>
-      <w:pPr>
-        <w:pStyle w:val="Heading3"/>
-      </w:pPr>
-      <w:r>
-        <w:t xml:space="preserve">6.2. End Event</w:t>
-      </w:r>
-    </w:p>
-    <w:p>
-      <w:pPr>
-        <w:numPr>
-          <w:ilvl w:val="0"/>
-          <w:numId w:val="1015"/>
-        </w:numPr>
-        <w:pStyle w:val="Compact"/>
-      </w:pPr>
-      <w:r>
-        <w:rPr>
-          <w:bCs/>
-          <w:b/>
-        </w:rPr>
-        <w:t xml:space="preserve">ID</w:t>
-      </w:r>
-      <w:r>
-        <w:t xml:space="preserve">: EndEvent_2</w:t>
-      </w:r>
-    </w:p>
-    <w:p>
-      <w:pPr>
-        <w:numPr>
-          <w:ilvl w:val="0"/>
-          <w:numId w:val="1015"/>
-        </w:numPr>
-        <w:pStyle w:val="Compact"/>
-      </w:pPr>
-      <w:r>
-        <w:rPr>
-          <w:bCs/>
-          <w:b/>
-        </w:rPr>
-        <w:t xml:space="preserve">Component Version</w:t>
-      </w:r>
-      <w:r>
-        <w:t xml:space="preserve">: 1.1</w:t>
-      </w:r>
-    </w:p>
-    <w:bookmarkEnd w:id="33"/>
-    <w:bookmarkEnd w:id="34"/>
-    <w:bookmarkStart w:id="38" w:name="properties"/>
-    <w:p>
-      <w:pPr>
-        <w:pStyle w:val="Heading2"/>
-      </w:pPr>
-      <w:r>
-        <w:t xml:space="preserve">7. Properties</w:t>
-      </w:r>
-    </w:p>
-    <w:bookmarkStart w:id="35" w:name="global-properties"/>
-    <w:p>
-      <w:pPr>
-        <w:pStyle w:val="Heading3"/>
-      </w:pPr>
-      <w:r>
-        <w:t xml:space="preserve">7.1. Global Properties</w:t>
-      </w:r>
-    </w:p>
-    <w:p>
-      <w:pPr>
-        <w:numPr>
-          <w:ilvl w:val="0"/>
-          <w:numId w:val="1016"/>
-        </w:numPr>
-        <w:pStyle w:val="Compact"/>
-      </w:pPr>
-      <w:r>
-        <w:rPr>
-          <w:bCs/>
-          <w:b/>
-        </w:rPr>
-        <w:t xml:space="preserve">Namespace Mapping</w:t>
-      </w:r>
-      <w:r>
-        <w:t xml:space="preserve">: Not configured.</w:t>
-      </w:r>
-    </w:p>
-    <w:p>
-      <w:pPr>
-        <w:numPr>
-          <w:ilvl w:val="0"/>
-          <w:numId w:val="1016"/>
-        </w:numPr>
-        <w:pStyle w:val="Compact"/>
-      </w:pPr>
-      <w:r>
-        <w:rPr>
-          <w:bCs/>
-          <w:b/>
-        </w:rPr>
-        <w:t xml:space="preserve">HTTP Session Handling</w:t>
-      </w:r>
-      <w:r>
-        <w:t xml:space="preserve">: None</w:t>
-      </w:r>
-    </w:p>
-    <w:p>
-      <w:pPr>
-        <w:numPr>
-          <w:ilvl w:val="0"/>
-          <w:numId w:val="1016"/>
-        </w:numPr>
-        <w:pStyle w:val="Compact"/>
-      </w:pPr>
-      <w:r>
-        <w:rPr>
-          <w:bCs/>
-          <w:b/>
-        </w:rPr>
-        <w:t xml:space="preserve">Logging Level</w:t>
-      </w:r>
-      <w:r>
-        <w:t xml:space="preserve">: All events</w:t>
-      </w:r>
-    </w:p>
-    <w:p>
-      <w:pPr>
-        <w:numPr>
-          <w:ilvl w:val="0"/>
-          <w:numId w:val="1016"/>
-        </w:numPr>
-        <w:pStyle w:val="Compact"/>
-      </w:pPr>
-      <w:r>
-        <w:rPr>
-          <w:bCs/>
-          <w:b/>
-        </w:rPr>
-        <w:t xml:space="preserve">CORS Enabled</w:t>
-      </w:r>
-      <w:r>
-        <w:t xml:space="preserve">: False</w:t>
-      </w:r>
-    </w:p>
-    <w:p>
-      <w:pPr>
-        <w:numPr>
-          <w:ilvl w:val="0"/>
-          <w:numId w:val="1016"/>
-        </w:numPr>
-        <w:pStyle w:val="Compact"/>
-      </w:pPr>
-      <w:r>
-        <w:rPr>
-          <w:bCs/>
-          <w:b/>
-        </w:rPr>
-        <w:t xml:space="preserve">Return Exception to Sender</w:t>
-      </w:r>
-      <w:r>
-        <w:t xml:space="preserve">: False</w:t>
-      </w:r>
-    </w:p>
-    <w:bookmarkEnd w:id="35"/>
-    <w:bookmarkStart w:id="36" w:name="sender-properties"/>
-    <w:p>
-      <w:pPr>
-        <w:pStyle w:val="Heading3"/>
-      </w:pPr>
-      <w:r>
-        <w:t xml:space="preserve">7.2. Sender Properties</w:t>
-      </w:r>
-    </w:p>
-    <w:p>
-      <w:pPr>
-        <w:numPr>
-          <w:ilvl w:val="0"/>
-          <w:numId w:val="1017"/>
-        </w:numPr>
-        <w:pStyle w:val="Compact"/>
-      </w:pPr>
-      <w:r>
-        <w:rPr>
-          <w:bCs/>
-          <w:b/>
-        </w:rPr>
-        <w:t xml:space="preserve">Enable Basic Authentication</w:t>
-      </w:r>
-      <w:r>
-        <w:t xml:space="preserve">: False</w:t>
-      </w:r>
-    </w:p>
-    <w:p>
-      <w:pPr>
-        <w:numPr>
-          <w:ilvl w:val="0"/>
-          <w:numId w:val="1017"/>
-        </w:numPr>
-        <w:pStyle w:val="Compact"/>
-      </w:pPr>
-      <w:r>
-        <w:rPr>
-          <w:bCs/>
-          <w:b/>
-        </w:rPr>
-        <w:t xml:space="preserve">Type</w:t>
-      </w:r>
-      <w:r>
-        <w:t xml:space="preserve">: EndpointSender</w:t>
-      </w:r>
-    </w:p>
-    <w:bookmarkEnd w:id="36"/>
-    <w:bookmarkStart w:id="37" w:name="receiver-properties"/>
-    <w:p>
-      <w:pPr>
-        <w:pStyle w:val="Heading3"/>
-      </w:pPr>
-      <w:r>
-        <w:t xml:space="preserve">7.3. Receiver Properties</w:t>
-      </w:r>
-    </w:p>
-    <w:p>
-      <w:pPr>
-        <w:numPr>
-          <w:ilvl w:val="0"/>
-          <w:numId w:val="1018"/>
-        </w:numPr>
-        <w:pStyle w:val="Compact"/>
-      </w:pPr>
-      <w:r>
-        <w:rPr>
-          <w:bCs/>
-          <w:b/>
-        </w:rPr>
-        <w:t xml:space="preserve">Type</w:t>
-      </w:r>
-      <w:r>
-        <w:t xml:space="preserve">: EndpointReceiver</w:t>
-      </w:r>
-    </w:p>
-    <w:bookmarkEnd w:id="37"/>
-    <w:bookmarkEnd w:id="38"/>
-    <w:bookmarkStart w:id="39" w:name="diagram"/>
-    <w:p>
-      <w:pPr>
-        <w:pStyle w:val="Heading2"/>
-      </w:pPr>
-      <w:r>
-        <w:t xml:space="preserve">8. Diagram</w:t>
-      </w:r>
-    </w:p>
-    <w:p>
-      <w:pPr>
-        <w:pStyle w:val="FirstParagraph"/>
-      </w:pPr>
-      <w:r>
-        <w:t xml:space="preserve">The iFlow is visually represented in a BPMN diagram, illustrating the flow of messages and the interactions between different components.</w:t>
-      </w:r>
-    </w:p>
-    <w:bookmarkEnd w:id="39"/>
-    <w:bookmarkStart w:id="40" w:name="conclusion"/>
-    <w:p>
-      <w:pPr>
-        <w:pStyle w:val="Heading2"/>
-      </w:pPr>
-      <w:r>
-        <w:t xml:space="preserve">9. Conclusion</w:t>
-      </w:r>
-    </w:p>
-    <w:p>
-      <w:pPr>
-        <w:pStyle w:val="FirstParagraph"/>
-      </w:pPr>
-      <w:r>
-        <w:t xml:space="preserve">The</w:t>
-      </w:r>
-      <w:r>
-        <w:t xml:space="preserve"> </w:t>
-      </w:r>
-      <w:r>
-        <w:t xml:space="preserve">‘</w:t>
-      </w:r>
-      <w:r>
-        <w:t xml:space="preserve">integrationflow</w:t>
-      </w:r>
-      <w:r>
-        <w:t xml:space="preserve">’</w:t>
-      </w:r>
-      <w:r>
-        <w:t xml:space="preserve"> </w:t>
-      </w:r>
-      <w:r>
-        <w:t xml:space="preserve">iFlow effectively integrates email communication by leveraging IMAP for receiving emails and SMTP for sending emails. The structured approach with defined participants, message flows, and processing activities ensures a robust integration solution.</w:t>
-      </w:r>
-    </w:p>
-    <w:bookmarkEnd w:id="40"/>
-    <w:bookmarkEnd w:id="41"/>
     <w:sectPr>
       <w:headerReference r:id="rId9" w:type="default"/>
       <w:pgSz w:h="15840" w:w="12240"/>
@@ -1989,6 +963,261 @@
       </w:pPr>
     </w:lvl>
   </w:abstractNum>
+  <w:abstractNum w:abstractNumId="99412">
+    <w:nsid w:val="A99412"/>
+    <w:multiLevelType w:val="multilevel"/>
+    <w:lvl w:ilvl="0">
+      <w:start w:val="2"/>
+      <w:numFmt w:val="decimal"/>
+      <w:lvlText w:val="%1."/>
+      <w:lvlJc w:val="left"/>
+      <w:pPr>
+        <w:ind w:left="720" w:hanging="480"/>
+      </w:pPr>
+    </w:lvl>
+    <w:lvl w:ilvl="1">
+      <w:start w:val="2"/>
+      <w:numFmt w:val="decimal"/>
+      <w:lvlText w:val="%2."/>
+      <w:lvlJc w:val="left"/>
+      <w:pPr>
+        <w:ind w:left="1440" w:hanging="480"/>
+      </w:pPr>
+    </w:lvl>
+    <w:lvl w:ilvl="2">
+      <w:start w:val="2"/>
+      <w:numFmt w:val="decimal"/>
+      <w:lvlText w:val="%3."/>
+      <w:lvlJc w:val="left"/>
+      <w:pPr>
+        <w:ind w:left="2160" w:hanging="480"/>
+      </w:pPr>
+    </w:lvl>
+    <w:lvl w:ilvl="3">
+      <w:start w:val="2"/>
+      <w:numFmt w:val="decimal"/>
+      <w:lvlText w:val="%4."/>
+      <w:lvlJc w:val="left"/>
+      <w:pPr>
+        <w:ind w:left="2880" w:hanging="480"/>
+      </w:pPr>
+    </w:lvl>
+    <w:lvl w:ilvl="4">
+      <w:start w:val="2"/>
+      <w:numFmt w:val="decimal"/>
+      <w:lvlText w:val="%5."/>
+      <w:lvlJc w:val="left"/>
+      <w:pPr>
+        <w:ind w:left="3600" w:hanging="480"/>
+      </w:pPr>
+    </w:lvl>
+    <w:lvl w:ilvl="5">
+      <w:start w:val="2"/>
+      <w:numFmt w:val="decimal"/>
+      <w:lvlText w:val="%6."/>
+      <w:lvlJc w:val="left"/>
+      <w:pPr>
+        <w:ind w:left="4320" w:hanging="480"/>
+      </w:pPr>
+    </w:lvl>
+    <w:lvl w:ilvl="6">
+      <w:start w:val="2"/>
+      <w:numFmt w:val="decimal"/>
+      <w:lvlText w:val="%7."/>
+      <w:lvlJc w:val="left"/>
+      <w:pPr>
+        <w:ind w:left="5040" w:hanging="480"/>
+      </w:pPr>
+    </w:lvl>
+    <w:lvl w:ilvl="7">
+      <w:start w:val="2"/>
+      <w:numFmt w:val="decimal"/>
+      <w:lvlText w:val="%8."/>
+      <w:lvlJc w:val="left"/>
+      <w:pPr>
+        <w:ind w:left="5760" w:hanging="480"/>
+      </w:pPr>
+    </w:lvl>
+    <w:lvl w:ilvl="8">
+      <w:start w:val="2"/>
+      <w:numFmt w:val="decimal"/>
+      <w:lvlText w:val="%9."/>
+      <w:lvlJc w:val="left"/>
+      <w:pPr>
+        <w:ind w:left="6480" w:hanging="480"/>
+      </w:pPr>
+    </w:lvl>
+  </w:abstractNum>
+  <w:abstractNum w:abstractNumId="99413">
+    <w:nsid w:val="A99413"/>
+    <w:multiLevelType w:val="multilevel"/>
+    <w:lvl w:ilvl="0">
+      <w:start w:val="3"/>
+      <w:numFmt w:val="decimal"/>
+      <w:lvlText w:val="%1."/>
+      <w:lvlJc w:val="left"/>
+      <w:pPr>
+        <w:ind w:left="720" w:hanging="480"/>
+      </w:pPr>
+    </w:lvl>
+    <w:lvl w:ilvl="1">
+      <w:start w:val="3"/>
+      <w:numFmt w:val="decimal"/>
+      <w:lvlText w:val="%2."/>
+      <w:lvlJc w:val="left"/>
+      <w:pPr>
+        <w:ind w:left="1440" w:hanging="480"/>
+      </w:pPr>
+    </w:lvl>
+    <w:lvl w:ilvl="2">
+      <w:start w:val="3"/>
+      <w:numFmt w:val="decimal"/>
+      <w:lvlText w:val="%3."/>
+      <w:lvlJc w:val="left"/>
+      <w:pPr>
+        <w:ind w:left="2160" w:hanging="480"/>
+      </w:pPr>
+    </w:lvl>
+    <w:lvl w:ilvl="3">
+      <w:start w:val="3"/>
+      <w:numFmt w:val="decimal"/>
+      <w:lvlText w:val="%4."/>
+      <w:lvlJc w:val="left"/>
+      <w:pPr>
+        <w:ind w:left="2880" w:hanging="480"/>
+      </w:pPr>
+    </w:lvl>
+    <w:lvl w:ilvl="4">
+      <w:start w:val="3"/>
+      <w:numFmt w:val="decimal"/>
+      <w:lvlText w:val="%5."/>
+      <w:lvlJc w:val="left"/>
+      <w:pPr>
+        <w:ind w:left="3600" w:hanging="480"/>
+      </w:pPr>
+    </w:lvl>
+    <w:lvl w:ilvl="5">
+      <w:start w:val="3"/>
+      <w:numFmt w:val="decimal"/>
+      <w:lvlText w:val="%6."/>
+      <w:lvlJc w:val="left"/>
+      <w:pPr>
+        <w:ind w:left="4320" w:hanging="480"/>
+      </w:pPr>
+    </w:lvl>
+    <w:lvl w:ilvl="6">
+      <w:start w:val="3"/>
+      <w:numFmt w:val="decimal"/>
+      <w:lvlText w:val="%7."/>
+      <w:lvlJc w:val="left"/>
+      <w:pPr>
+        <w:ind w:left="5040" w:hanging="480"/>
+      </w:pPr>
+    </w:lvl>
+    <w:lvl w:ilvl="7">
+      <w:start w:val="3"/>
+      <w:numFmt w:val="decimal"/>
+      <w:lvlText w:val="%8."/>
+      <w:lvlJc w:val="left"/>
+      <w:pPr>
+        <w:ind w:left="5760" w:hanging="480"/>
+      </w:pPr>
+    </w:lvl>
+    <w:lvl w:ilvl="8">
+      <w:start w:val="3"/>
+      <w:numFmt w:val="decimal"/>
+      <w:lvlText w:val="%9."/>
+      <w:lvlJc w:val="left"/>
+      <w:pPr>
+        <w:ind w:left="6480" w:hanging="480"/>
+      </w:pPr>
+    </w:lvl>
+  </w:abstractNum>
+  <w:abstractNum w:abstractNumId="99414">
+    <w:nsid w:val="A99414"/>
+    <w:multiLevelType w:val="multilevel"/>
+    <w:lvl w:ilvl="0">
+      <w:start w:val="4"/>
+      <w:numFmt w:val="decimal"/>
+      <w:lvlText w:val="%1."/>
+      <w:lvlJc w:val="left"/>
+      <w:pPr>
+        <w:ind w:left="720" w:hanging="480"/>
+      </w:pPr>
+    </w:lvl>
+    <w:lvl w:ilvl="1">
+      <w:start w:val="4"/>
+      <w:numFmt w:val="decimal"/>
+      <w:lvlText w:val="%2."/>
+      <w:lvlJc w:val="left"/>
+      <w:pPr>
+        <w:ind w:left="1440" w:hanging="480"/>
+      </w:pPr>
+    </w:lvl>
+    <w:lvl w:ilvl="2">
+      <w:start w:val="4"/>
+      <w:numFmt w:val="decimal"/>
+      <w:lvlText w:val="%3."/>
+      <w:lvlJc w:val="left"/>
+      <w:pPr>
+        <w:ind w:left="2160" w:hanging="480"/>
+      </w:pPr>
+    </w:lvl>
+    <w:lvl w:ilvl="3">
+      <w:start w:val="4"/>
+      <w:numFmt w:val="decimal"/>
+      <w:lvlText w:val="%4."/>
+      <w:lvlJc w:val="left"/>
+      <w:pPr>
+        <w:ind w:left="2880" w:hanging="480"/>
+      </w:pPr>
+    </w:lvl>
+    <w:lvl w:ilvl="4">
+      <w:start w:val="4"/>
+      <w:numFmt w:val="decimal"/>
+      <w:lvlText w:val="%5."/>
+      <w:lvlJc w:val="left"/>
+      <w:pPr>
+        <w:ind w:left="3600" w:hanging="480"/>
+      </w:pPr>
+    </w:lvl>
+    <w:lvl w:ilvl="5">
+      <w:start w:val="4"/>
+      <w:numFmt w:val="decimal"/>
+      <w:lvlText w:val="%6."/>
+      <w:lvlJc w:val="left"/>
+      <w:pPr>
+        <w:ind w:left="4320" w:hanging="480"/>
+      </w:pPr>
+    </w:lvl>
+    <w:lvl w:ilvl="6">
+      <w:start w:val="4"/>
+      <w:numFmt w:val="decimal"/>
+      <w:lvlText w:val="%7."/>
+      <w:lvlJc w:val="left"/>
+      <w:pPr>
+        <w:ind w:left="5040" w:hanging="480"/>
+      </w:pPr>
+    </w:lvl>
+    <w:lvl w:ilvl="7">
+      <w:start w:val="4"/>
+      <w:numFmt w:val="decimal"/>
+      <w:lvlText w:val="%8."/>
+      <w:lvlJc w:val="left"/>
+      <w:pPr>
+        <w:ind w:left="5760" w:hanging="480"/>
+      </w:pPr>
+    </w:lvl>
+    <w:lvl w:ilvl="8">
+      <w:start w:val="4"/>
+      <w:numFmt w:val="decimal"/>
+      <w:lvlText w:val="%9."/>
+      <w:lvlJc w:val="left"/>
+      <w:pPr>
+        <w:ind w:left="6480" w:hanging="480"/>
+      </w:pPr>
+    </w:lvl>
+  </w:abstractNum>
   <w:abstractNum w:abstractNumId="991">
     <w:nsid w:val="A991"/>
     <w:multiLevelType w:val="multilevel"/>
@@ -2059,6 +1288,91 @@
     <w:lvl w:ilvl="8">
       <w:numFmt w:val="bullet"/>
       <w:lvlText w:val="•"/>
+      <w:lvlJc w:val="left"/>
+      <w:pPr>
+        <w:ind w:left="6480" w:hanging="480"/>
+      </w:pPr>
+    </w:lvl>
+  </w:abstractNum>
+  <w:abstractNum w:abstractNumId="99415">
+    <w:nsid w:val="A99415"/>
+    <w:multiLevelType w:val="multilevel"/>
+    <w:lvl w:ilvl="0">
+      <w:start w:val="5"/>
+      <w:numFmt w:val="decimal"/>
+      <w:lvlText w:val="%1."/>
+      <w:lvlJc w:val="left"/>
+      <w:pPr>
+        <w:ind w:left="720" w:hanging="480"/>
+      </w:pPr>
+    </w:lvl>
+    <w:lvl w:ilvl="1">
+      <w:start w:val="5"/>
+      <w:numFmt w:val="decimal"/>
+      <w:lvlText w:val="%2."/>
+      <w:lvlJc w:val="left"/>
+      <w:pPr>
+        <w:ind w:left="1440" w:hanging="480"/>
+      </w:pPr>
+    </w:lvl>
+    <w:lvl w:ilvl="2">
+      <w:start w:val="5"/>
+      <w:numFmt w:val="decimal"/>
+      <w:lvlText w:val="%3."/>
+      <w:lvlJc w:val="left"/>
+      <w:pPr>
+        <w:ind w:left="2160" w:hanging="480"/>
+      </w:pPr>
+    </w:lvl>
+    <w:lvl w:ilvl="3">
+      <w:start w:val="5"/>
+      <w:numFmt w:val="decimal"/>
+      <w:lvlText w:val="%4."/>
+      <w:lvlJc w:val="left"/>
+      <w:pPr>
+        <w:ind w:left="2880" w:hanging="480"/>
+      </w:pPr>
+    </w:lvl>
+    <w:lvl w:ilvl="4">
+      <w:start w:val="5"/>
+      <w:numFmt w:val="decimal"/>
+      <w:lvlText w:val="%5."/>
+      <w:lvlJc w:val="left"/>
+      <w:pPr>
+        <w:ind w:left="3600" w:hanging="480"/>
+      </w:pPr>
+    </w:lvl>
+    <w:lvl w:ilvl="5">
+      <w:start w:val="5"/>
+      <w:numFmt w:val="decimal"/>
+      <w:lvlText w:val="%6."/>
+      <w:lvlJc w:val="left"/>
+      <w:pPr>
+        <w:ind w:left="4320" w:hanging="480"/>
+      </w:pPr>
+    </w:lvl>
+    <w:lvl w:ilvl="6">
+      <w:start w:val="5"/>
+      <w:numFmt w:val="decimal"/>
+      <w:lvlText w:val="%7."/>
+      <w:lvlJc w:val="left"/>
+      <w:pPr>
+        <w:ind w:left="5040" w:hanging="480"/>
+      </w:pPr>
+    </w:lvl>
+    <w:lvl w:ilvl="7">
+      <w:start w:val="5"/>
+      <w:numFmt w:val="decimal"/>
+      <w:lvlText w:val="%8."/>
+      <w:lvlJc w:val="left"/>
+      <w:pPr>
+        <w:ind w:left="5760" w:hanging="480"/>
+      </w:pPr>
+    </w:lvl>
+    <w:lvl w:ilvl="8">
+      <w:start w:val="5"/>
+      <w:numFmt w:val="decimal"/>
+      <w:lvlText w:val="%9."/>
       <w:lvlJc w:val="left"/>
       <w:pPr>
         <w:ind w:left="6480" w:hanging="480"/>
@@ -2126,54 +1440,159 @@
     </w:lvlOverride>
   </w:num>
   <w:num w:numId="1002">
-    <w:abstractNumId w:val="991"/>
+    <w:abstractNumId w:val="99411"/>
+    <w:lvlOverride w:ilvl="0">
+      <w:startOverride w:val="1"/>
+    </w:lvlOverride>
+    <w:lvlOverride w:ilvl="1">
+      <w:startOverride w:val="1"/>
+    </w:lvlOverride>
+    <w:lvlOverride w:ilvl="2">
+      <w:startOverride w:val="1"/>
+    </w:lvlOverride>
+    <w:lvlOverride w:ilvl="3">
+      <w:startOverride w:val="1"/>
+    </w:lvlOverride>
+    <w:lvlOverride w:ilvl="4">
+      <w:startOverride w:val="1"/>
+    </w:lvlOverride>
+    <w:lvlOverride w:ilvl="5">
+      <w:startOverride w:val="1"/>
+    </w:lvlOverride>
+    <w:lvlOverride w:ilvl="6">
+      <w:startOverride w:val="1"/>
+    </w:lvlOverride>
+    <w:lvlOverride w:ilvl="7">
+      <w:startOverride w:val="1"/>
+    </w:lvlOverride>
+    <w:lvlOverride w:ilvl="8">
+      <w:startOverride w:val="1"/>
+    </w:lvlOverride>
   </w:num>
   <w:num w:numId="1003">
-    <w:abstractNumId w:val="991"/>
+    <w:abstractNumId w:val="99412"/>
+    <w:lvlOverride w:ilvl="0">
+      <w:startOverride w:val="2"/>
+    </w:lvlOverride>
+    <w:lvlOverride w:ilvl="1">
+      <w:startOverride w:val="2"/>
+    </w:lvlOverride>
+    <w:lvlOverride w:ilvl="2">
+      <w:startOverride w:val="2"/>
+    </w:lvlOverride>
+    <w:lvlOverride w:ilvl="3">
+      <w:startOverride w:val="2"/>
+    </w:lvlOverride>
+    <w:lvlOverride w:ilvl="4">
+      <w:startOverride w:val="2"/>
+    </w:lvlOverride>
+    <w:lvlOverride w:ilvl="5">
+      <w:startOverride w:val="2"/>
+    </w:lvlOverride>
+    <w:lvlOverride w:ilvl="6">
+      <w:startOverride w:val="2"/>
+    </w:lvlOverride>
+    <w:lvlOverride w:ilvl="7">
+      <w:startOverride w:val="2"/>
+    </w:lvlOverride>
+    <w:lvlOverride w:ilvl="8">
+      <w:startOverride w:val="2"/>
+    </w:lvlOverride>
   </w:num>
   <w:num w:numId="1004">
-    <w:abstractNumId w:val="991"/>
+    <w:abstractNumId w:val="99413"/>
+    <w:lvlOverride w:ilvl="0">
+      <w:startOverride w:val="3"/>
+    </w:lvlOverride>
+    <w:lvlOverride w:ilvl="1">
+      <w:startOverride w:val="3"/>
+    </w:lvlOverride>
+    <w:lvlOverride w:ilvl="2">
+      <w:startOverride w:val="3"/>
+    </w:lvlOverride>
+    <w:lvlOverride w:ilvl="3">
+      <w:startOverride w:val="3"/>
+    </w:lvlOverride>
+    <w:lvlOverride w:ilvl="4">
+      <w:startOverride w:val="3"/>
+    </w:lvlOverride>
+    <w:lvlOverride w:ilvl="5">
+      <w:startOverride w:val="3"/>
+    </w:lvlOverride>
+    <w:lvlOverride w:ilvl="6">
+      <w:startOverride w:val="3"/>
+    </w:lvlOverride>
+    <w:lvlOverride w:ilvl="7">
+      <w:startOverride w:val="3"/>
+    </w:lvlOverride>
+    <w:lvlOverride w:ilvl="8">
+      <w:startOverride w:val="3"/>
+    </w:lvlOverride>
   </w:num>
   <w:num w:numId="1005">
-    <w:abstractNumId w:val="991"/>
+    <w:abstractNumId w:val="99414"/>
+    <w:lvlOverride w:ilvl="0">
+      <w:startOverride w:val="4"/>
+    </w:lvlOverride>
+    <w:lvlOverride w:ilvl="1">
+      <w:startOverride w:val="4"/>
+    </w:lvlOverride>
+    <w:lvlOverride w:ilvl="2">
+      <w:startOverride w:val="4"/>
+    </w:lvlOverride>
+    <w:lvlOverride w:ilvl="3">
+      <w:startOverride w:val="4"/>
+    </w:lvlOverride>
+    <w:lvlOverride w:ilvl="4">
+      <w:startOverride w:val="4"/>
+    </w:lvlOverride>
+    <w:lvlOverride w:ilvl="5">
+      <w:startOverride w:val="4"/>
+    </w:lvlOverride>
+    <w:lvlOverride w:ilvl="6">
+      <w:startOverride w:val="4"/>
+    </w:lvlOverride>
+    <w:lvlOverride w:ilvl="7">
+      <w:startOverride w:val="4"/>
+    </w:lvlOverride>
+    <w:lvlOverride w:ilvl="8">
+      <w:startOverride w:val="4"/>
+    </w:lvlOverride>
   </w:num>
   <w:num w:numId="1006">
     <w:abstractNumId w:val="991"/>
   </w:num>
   <w:num w:numId="1007">
-    <w:abstractNumId w:val="991"/>
+    <w:abstractNumId w:val="99415"/>
+    <w:lvlOverride w:ilvl="0">
+      <w:startOverride w:val="5"/>
+    </w:lvlOverride>
+    <w:lvlOverride w:ilvl="1">
+      <w:startOverride w:val="5"/>
+    </w:lvlOverride>
+    <w:lvlOverride w:ilvl="2">
+      <w:startOverride w:val="5"/>
+    </w:lvlOverride>
+    <w:lvlOverride w:ilvl="3">
+      <w:startOverride w:val="5"/>
+    </w:lvlOverride>
+    <w:lvlOverride w:ilvl="4">
+      <w:startOverride w:val="5"/>
+    </w:lvlOverride>
+    <w:lvlOverride w:ilvl="5">
+      <w:startOverride w:val="5"/>
+    </w:lvlOverride>
+    <w:lvlOverride w:ilvl="6">
+      <w:startOverride w:val="5"/>
+    </w:lvlOverride>
+    <w:lvlOverride w:ilvl="7">
+      <w:startOverride w:val="5"/>
+    </w:lvlOverride>
+    <w:lvlOverride w:ilvl="8">
+      <w:startOverride w:val="5"/>
+    </w:lvlOverride>
   </w:num>
   <w:num w:numId="1008">
-    <w:abstractNumId w:val="991"/>
-  </w:num>
-  <w:num w:numId="1009">
-    <w:abstractNumId w:val="991"/>
-  </w:num>
-  <w:num w:numId="1010">
-    <w:abstractNumId w:val="991"/>
-  </w:num>
-  <w:num w:numId="1011">
-    <w:abstractNumId w:val="991"/>
-  </w:num>
-  <w:num w:numId="1012">
-    <w:abstractNumId w:val="991"/>
-  </w:num>
-  <w:num w:numId="1013">
-    <w:abstractNumId w:val="991"/>
-  </w:num>
-  <w:num w:numId="1014">
-    <w:abstractNumId w:val="991"/>
-  </w:num>
-  <w:num w:numId="1015">
-    <w:abstractNumId w:val="991"/>
-  </w:num>
-  <w:num w:numId="1016">
-    <w:abstractNumId w:val="991"/>
-  </w:num>
-  <w:num w:numId="1017">
-    <w:abstractNumId w:val="991"/>
-  </w:num>
-  <w:num w:numId="1018">
     <w:abstractNumId w:val="991"/>
   </w:num>
 </w:numbering>

</xml_diff>

<commit_message>
🤖 DOCS: Proper Cover + TOC + Structured Content
</commit_message>
<xml_diff>
--- a/cpi-artifacts/EmailreceiverxlsxToXML/CPI-Mail-Reader_3/src/main/resources/scenarioflows/integrationflow/integrationflow_Technical_Specification.docx
+++ b/cpi-artifacts/EmailreceiverxlsxToXML/CPI-Mail-Reader_3/src/main/resources/scenarioflows/integrationflow/integrationflow_Technical_Specification.docx
@@ -187,16 +187,22 @@
         <w:t xml:space="preserve">Reference Documents</w:t>
       </w:r>
     </w:p>
+    <w:bookmarkStart w:id="22" w:name="introduction"/>
     <w:p>
       <w:pPr>
-        <w:numPr>
-          <w:ilvl w:val="0"/>
-          <w:numId w:val="1002"/>
-        </w:numPr>
-        <w:pStyle w:val="Compact"/>
+        <w:pStyle w:val="Heading1"/>
       </w:pPr>
       <w:r>
-        <w:t xml:space="preserve">Introduction</w:t>
+        <w:t xml:space="preserve">1. Introduction</w:t>
+      </w:r>
+    </w:p>
+    <w:bookmarkStart w:id="20" w:name="purpose"/>
+    <w:p>
+      <w:pPr>
+        <w:pStyle w:val="Heading2"/>
+      </w:pPr>
+      <w:r>
+        <w:t xml:space="preserve">1.1 Purpose</w:t>
       </w:r>
     </w:p>
     <w:p>
@@ -204,13 +210,7 @@
         <w:pStyle w:val="FirstParagraph"/>
       </w:pPr>
       <w:r>
-        <w:t xml:space="preserve">1.1 Purpose</w:t>
-      </w:r>
-      <w:r>
-        <w:t xml:space="preserve"> </w:t>
-      </w:r>
-      <w:r>
-        <w:t xml:space="preserve">- The purpose of this iFlow, named</w:t>
+        <w:t xml:space="preserve">The purpose of this document is to provide a comprehensive overview of the iFlow named</w:t>
       </w:r>
       <w:r>
         <w:t xml:space="preserve"> </w:t>
@@ -225,21 +225,158 @@
         <w:t xml:space="preserve">’</w:t>
       </w:r>
       <w:r>
-        <w:t xml:space="preserve">, is to facilitate the integration of email communication by retrieving unread emails from a Gmail account and sending the content as an email attachment to a specified recipient. This process automates the handling of email data, ensuring timely and efficient communication.</w:t>
+        <w:t xml:space="preserve">, detailing its integration architecture, components, scenarios, error handling, and testing validation.</w:t>
+      </w:r>
+    </w:p>
+    <w:bookmarkEnd w:id="20"/>
+    <w:bookmarkStart w:id="21" w:name="scope"/>
+    <w:p>
+      <w:pPr>
+        <w:pStyle w:val="Heading2"/>
+      </w:pPr>
+      <w:r>
+        <w:t xml:space="preserve">1.2 Scope</w:t>
       </w:r>
     </w:p>
     <w:p>
       <w:pPr>
-        <w:pStyle w:val="BodyText"/>
+        <w:pStyle w:val="FirstParagraph"/>
       </w:pPr>
       <w:r>
-        <w:t xml:space="preserve">1.2 Scope</w:t>
+        <w:t xml:space="preserve">This document covers the integration flow designed to process emails using IMAP for incoming messages and SMTP for outgoing messages, including the associated data transformations and error handling mechanisms.</w:t>
+      </w:r>
+    </w:p>
+    <w:bookmarkEnd w:id="21"/>
+    <w:bookmarkEnd w:id="22"/>
+    <w:bookmarkStart w:id="25" w:name="integration-overview"/>
+    <w:p>
+      <w:pPr>
+        <w:pStyle w:val="Heading1"/>
+      </w:pPr>
+      <w:r>
+        <w:t xml:space="preserve">2. Integration Overview</w:t>
+      </w:r>
+    </w:p>
+    <w:bookmarkStart w:id="23" w:name="integration-architecture"/>
+    <w:p>
+      <w:pPr>
+        <w:pStyle w:val="Heading2"/>
+      </w:pPr>
+      <w:r>
+        <w:t xml:space="preserve">2.1 Integration Architecture</w:t>
+      </w:r>
+    </w:p>
+    <w:p>
+      <w:pPr>
+        <w:pStyle w:val="FirstParagraph"/>
+      </w:pPr>
+      <w:r>
+        <w:t xml:space="preserve">The integration architecture consists of a sender and receiver participant, with an integration process that orchestrates the flow of data between them. The sender retrieves emails from an IMAP server, processes the data, and sends it to the receiver via SMTP.</w:t>
+      </w:r>
+    </w:p>
+    <w:bookmarkEnd w:id="23"/>
+    <w:bookmarkStart w:id="24" w:name="integration-components"/>
+    <w:p>
+      <w:pPr>
+        <w:pStyle w:val="Heading2"/>
+      </w:pPr>
+      <w:r>
+        <w:t xml:space="preserve">2.2 Integration Components</w:t>
+      </w:r>
+    </w:p>
+    <w:p>
+      <w:pPr>
+        <w:numPr>
+          <w:ilvl w:val="0"/>
+          <w:numId w:val="1002"/>
+        </w:numPr>
+        <w:pStyle w:val="Compact"/>
+      </w:pPr>
+      <w:r>
+        <w:rPr>
+          <w:bCs/>
+          <w:b/>
+        </w:rPr>
+        <w:t xml:space="preserve">Sender</w:t>
       </w:r>
       <w:r>
-        <w:t xml:space="preserve"> </w:t>
+        <w:t xml:space="preserve">: An IMAP endpoint configured to read emails from a Gmail account.</w:t>
+      </w:r>
+    </w:p>
+    <w:p>
+      <w:pPr>
+        <w:numPr>
+          <w:ilvl w:val="0"/>
+          <w:numId w:val="1002"/>
+        </w:numPr>
+        <w:pStyle w:val="Compact"/>
+      </w:pPr>
+      <w:r>
+        <w:rPr>
+          <w:bCs/>
+          <w:b/>
+        </w:rPr>
+        <w:t xml:space="preserve">Receiver</w:t>
       </w:r>
       <w:r>
-        <w:t xml:space="preserve">- This iFlow includes the integration of an IMAP email adapter for receiving emails and an SMTP email adapter for sending emails. The integration boundaries are defined between the sender (Gmail) and the receiver (specified email address). The iFlow does not include any external systems beyond the email services.</w:t>
+        <w:t xml:space="preserve">: An SMTP endpoint configured to send emails to a specified recipient.</w:t>
+      </w:r>
+    </w:p>
+    <w:p>
+      <w:pPr>
+        <w:numPr>
+          <w:ilvl w:val="0"/>
+          <w:numId w:val="1002"/>
+        </w:numPr>
+        <w:pStyle w:val="Compact"/>
+      </w:pPr>
+      <w:r>
+        <w:rPr>
+          <w:bCs/>
+          <w:b/>
+        </w:rPr>
+        <w:t xml:space="preserve">Integration Process</w:t>
+      </w:r>
+      <w:r>
+        <w:t xml:space="preserve">: Contains activities such as Groovy scripts and content modifiers to transform the data.</w:t>
+      </w:r>
+    </w:p>
+    <w:bookmarkEnd w:id="24"/>
+    <w:bookmarkEnd w:id="25"/>
+    <w:bookmarkStart w:id="29" w:name="integration-scenarios"/>
+    <w:p>
+      <w:pPr>
+        <w:pStyle w:val="Heading1"/>
+      </w:pPr>
+      <w:r>
+        <w:t xml:space="preserve">3. Integration Scenarios</w:t>
+      </w:r>
+    </w:p>
+    <w:bookmarkStart w:id="26" w:name="scenario-description"/>
+    <w:p>
+      <w:pPr>
+        <w:pStyle w:val="Heading2"/>
+      </w:pPr>
+      <w:r>
+        <w:t xml:space="preserve">3.1 Scenario Description</w:t>
+      </w:r>
+    </w:p>
+    <w:p>
+      <w:pPr>
+        <w:pStyle w:val="FirstParagraph"/>
+      </w:pPr>
+      <w:r>
+        <w:t xml:space="preserve">The integration flow retrieves unread emails from a Gmail inbox, processes the content, and forwards the relevant information as an email to a specified recipient.</w:t>
+      </w:r>
+    </w:p>
+    <w:bookmarkEnd w:id="26"/>
+    <w:bookmarkStart w:id="27" w:name="data-flows"/>
+    <w:p>
+      <w:pPr>
+        <w:pStyle w:val="Heading2"/>
+      </w:pPr>
+      <w:r>
+        <w:t xml:space="preserve">3.2 Data Flows</w:t>
       </w:r>
     </w:p>
     <w:p>
@@ -251,137 +388,79 @@
         <w:pStyle w:val="Compact"/>
       </w:pPr>
       <w:r>
-        <w:t xml:space="preserve">Integration Overview</w:t>
+        <w:rPr>
+          <w:bCs/>
+          <w:b/>
+        </w:rPr>
+        <w:t xml:space="preserve">Incoming Flow</w:t>
+      </w:r>
+      <w:r>
+        <w:t xml:space="preserve">:</w:t>
       </w:r>
     </w:p>
     <w:p>
       <w:pPr>
-        <w:pStyle w:val="FirstParagraph"/>
+        <w:numPr>
+          <w:ilvl w:val="1"/>
+          <w:numId w:val="1004"/>
+        </w:numPr>
+        <w:pStyle w:val="Compact"/>
       </w:pPr>
       <w:r>
-        <w:t xml:space="preserve">2.1 Integration Architecture</w:t>
-      </w:r>
-      <w:r>
-        <w:t xml:space="preserve"> </w:t>
-      </w:r>
-      <w:r>
-        <w:t xml:space="preserve">- The integration architecture consists of a sender participant that connects to the Gmail IMAP server to fetch unread emails, processes the email content through a series of activities (including Groovy scripts and content modifiers), and finally sends the processed content as an email attachment to a designated recipient via the SMTP server.</w:t>
+        <w:t xml:space="preserve">Emails are fetched from the IMAP server.</w:t>
       </w:r>
     </w:p>
     <w:p>
       <w:pPr>
-        <w:pStyle w:val="BodyText"/>
+        <w:numPr>
+          <w:ilvl w:val="1"/>
+          <w:numId w:val="1004"/>
+        </w:numPr>
+        <w:pStyle w:val="Compact"/>
       </w:pPr>
       <w:r>
-        <w:t xml:space="preserve">2.2 Integration Components</w:t>
-      </w:r>
-      <w:r>
-        <w:t xml:space="preserve"> </w:t>
-      </w:r>
-      <w:r>
-        <w:t xml:space="preserve">- Adapters:</w:t>
-      </w:r>
-      <w:r>
-        <w:t xml:space="preserve"> </w:t>
-      </w:r>
-      <w:r>
-        <w:t xml:space="preserve">- IMAP Adapter: Used to retrieve unread emails from the Gmail account.</w:t>
-      </w:r>
-      <w:r>
-        <w:t xml:space="preserve"> </w:t>
-      </w:r>
-      <w:r>
-        <w:t xml:space="preserve">- SMTP Adapter: Used to send emails with the processed content as an attachment.</w:t>
-      </w:r>
-      <w:r>
-        <w:t xml:space="preserve"> </w:t>
-      </w:r>
-      <w:r>
-        <w:t xml:space="preserve">- Scripts:</w:t>
-      </w:r>
-      <w:r>
-        <w:t xml:space="preserve"> </w:t>
-      </w:r>
-      <w:r>
-        <w:t xml:space="preserve">- Groovy Script: A script activity that processes the email content.</w:t>
-      </w:r>
-      <w:r>
-        <w:t xml:space="preserve"> </w:t>
-      </w:r>
-      <w:r>
-        <w:t xml:space="preserve">- Content Modifiers:</w:t>
-      </w:r>
-      <w:r>
-        <w:t xml:space="preserve"> </w:t>
-      </w:r>
-      <w:r>
-        <w:t xml:space="preserve">- Content Modifier 1 and Content Modifier 2: Activities that enrich the message content before sending.</w:t>
+        <w:t xml:space="preserve">The content is processed using Groovy scripts and content modifiers.</w:t>
       </w:r>
     </w:p>
     <w:p>
       <w:pPr>
         <w:numPr>
           <w:ilvl w:val="0"/>
-          <w:numId w:val="1004"/>
+          <w:numId w:val="1003"/>
         </w:numPr>
         <w:pStyle w:val="Compact"/>
       </w:pPr>
       <w:r>
-        <w:t xml:space="preserve">Integration Scenarios</w:t>
+        <w:rPr>
+          <w:bCs/>
+          <w:b/>
+        </w:rPr>
+        <w:t xml:space="preserve">Outgoing Flow</w:t>
+      </w:r>
+      <w:r>
+        <w:t xml:space="preserve">:</w:t>
       </w:r>
     </w:p>
     <w:p>
       <w:pPr>
-        <w:pStyle w:val="FirstParagraph"/>
-      </w:pPr>
-      <w:r>
-        <w:t xml:space="preserve">3.1 Scenario Description</w:t>
-      </w:r>
-      <w:r>
-        <w:t xml:space="preserve"> </w:t>
-      </w:r>
-      <w:r>
-        <w:t xml:space="preserve">- The integration flow begins with the Start Event, which triggers the retrieval of unread emails from the Gmail account using the IMAP adapter. The emails are processed through a Groovy script to extract relevant information. The processed data is then modified using two content modifiers to prepare it for sending. Finally, the End Event signifies the completion of the process after the email is sent to the specified recipient.</w:t>
-      </w:r>
-    </w:p>
-    <w:p>
-      <w:pPr>
-        <w:pStyle w:val="BodyText"/>
-      </w:pPr>
-      <w:r>
-        <w:t xml:space="preserve">3.2 Data Flows</w:t>
-      </w:r>
-      <w:r>
-        <w:t xml:space="preserve"> </w:t>
-      </w:r>
-      <w:r>
-        <w:t xml:space="preserve">- The message flow starts with the IMAP adapter fetching unread emails from the Gmail inbox. The email content is transformed and enriched using the Groovy script and content modifiers. The final output is routed to the SMTP adapter, which sends the email to the designated recipient.</w:t>
-      </w:r>
-    </w:p>
-    <w:p>
-      <w:pPr>
-        <w:pStyle w:val="BodyText"/>
-      </w:pPr>
-      <w:r>
-        <w:t xml:space="preserve">3.3 Security Requirements</w:t>
-      </w:r>
-      <w:r>
-        <w:t xml:space="preserve"> </w:t>
-      </w:r>
-      <w:r>
-        <w:t xml:space="preserve">- The integration requires basic authentication for both the IMAP and SMTP adapters. Credentials for accessing the Gmail account are specified within the iFlow. No additional authorization mechanisms are implemented.</w:t>
-      </w:r>
-    </w:p>
-    <w:p>
-      <w:pPr>
         <w:numPr>
-          <w:ilvl w:val="0"/>
+          <w:ilvl w:val="1"/>
           <w:numId w:val="1005"/>
         </w:numPr>
         <w:pStyle w:val="Compact"/>
       </w:pPr>
       <w:r>
-        <w:t xml:space="preserve">Error Handling and Logging</w:t>
+        <w:t xml:space="preserve">Processed content is sent as an email via the SMTP server.</w:t>
+      </w:r>
+    </w:p>
+    <w:bookmarkEnd w:id="27"/>
+    <w:bookmarkStart w:id="28" w:name="security-requirements"/>
+    <w:p>
+      <w:pPr>
+        <w:pStyle w:val="Heading2"/>
+      </w:pPr>
+      <w:r>
+        <w:t xml:space="preserve">3.3 Security Requirements</w:t>
       </w:r>
     </w:p>
     <w:p>
@@ -393,7 +472,264 @@
         <w:pStyle w:val="Compact"/>
       </w:pPr>
       <w:r>
-        <w:t xml:space="preserve">The iFlow implements a logging strategy that captures all events, allowing for comprehensive monitoring of the integration process. Error handling is managed by returning exceptions to the sender, ensuring that any issues encountered during processing are logged for further analysis.</w:t>
+        <w:t xml:space="preserve">Basic authentication is disabled for the sender.</w:t>
+      </w:r>
+    </w:p>
+    <w:p>
+      <w:pPr>
+        <w:numPr>
+          <w:ilvl w:val="0"/>
+          <w:numId w:val="1006"/>
+        </w:numPr>
+        <w:pStyle w:val="Compact"/>
+      </w:pPr>
+      <w:r>
+        <w:t xml:space="preserve">Secure connections are established using SSL/TLS for both IMAP and SMTP protocols.</w:t>
+      </w:r>
+    </w:p>
+    <w:bookmarkEnd w:id="28"/>
+    <w:bookmarkEnd w:id="29"/>
+    <w:bookmarkStart w:id="30" w:name="error-handling-and-logging"/>
+    <w:p>
+      <w:pPr>
+        <w:pStyle w:val="Heading1"/>
+      </w:pPr>
+      <w:r>
+        <w:t xml:space="preserve">4. Error Handling and Logging</w:t>
+      </w:r>
+    </w:p>
+    <w:p>
+      <w:pPr>
+        <w:pStyle w:val="FirstParagraph"/>
+      </w:pPr>
+      <w:r>
+        <w:t xml:space="preserve">The integration flow logs all events and handles errors by not returning exceptions to the sender. Any issues encountered during processing will be logged for further analysis.</w:t>
+      </w:r>
+    </w:p>
+    <w:bookmarkEnd w:id="30"/>
+    <w:bookmarkStart w:id="31" w:name="testing-validation"/>
+    <w:p>
+      <w:pPr>
+        <w:pStyle w:val="Heading1"/>
+      </w:pPr>
+      <w:r>
+        <w:t xml:space="preserve">5. Testing Validation</w:t>
+      </w:r>
+    </w:p>
+    <w:tbl>
+      <w:tblPr>
+        <w:tblStyle w:val="Table"/>
+        <w:tblW w:type="pct" w:w="5000"/>
+        <w:tblLook w:firstRow="1" w:lastRow="0" w:firstColumn="0" w:lastColumn="0" w:noHBand="0" w:noVBand="0" w:val="0020"/>
+        <w:jc w:val="start"/>
+      </w:tblPr>
+      <w:tblGrid>
+        <w:gridCol w:w="2640"/>
+        <w:gridCol w:w="1885"/>
+        <w:gridCol w:w="3394"/>
+      </w:tblGrid>
+      <w:tr>
+        <w:trPr>
+          <w:tblHeader w:val="true"/>
+        </w:trPr>
+        <w:tc>
+          <w:tcPr/>
+          <w:p>
+            <w:pPr>
+              <w:pStyle w:val="Compact"/>
+              <w:jc w:val="left"/>
+            </w:pPr>
+            <w:r>
+              <w:t xml:space="preserve">Test Case ID</w:t>
+            </w:r>
+          </w:p>
+        </w:tc>
+        <w:tc>
+          <w:tcPr/>
+          <w:p>
+            <w:pPr>
+              <w:pStyle w:val="Compact"/>
+              <w:jc w:val="left"/>
+            </w:pPr>
+            <w:r>
+              <w:t xml:space="preserve">Scenario</w:t>
+            </w:r>
+          </w:p>
+        </w:tc>
+        <w:tc>
+          <w:tcPr/>
+          <w:p>
+            <w:pPr>
+              <w:pStyle w:val="Compact"/>
+              <w:jc w:val="left"/>
+            </w:pPr>
+            <w:r>
+              <w:t xml:space="preserve">Expected Outcome</w:t>
+            </w:r>
+          </w:p>
+        </w:tc>
+      </w:tr>
+      <w:tr>
+        <w:tc>
+          <w:tcPr/>
+          <w:p>
+            <w:pPr>
+              <w:pStyle w:val="Compact"/>
+              <w:jc w:val="left"/>
+            </w:pPr>
+            <w:r>
+              <w:t xml:space="preserve">TC_001</w:t>
+            </w:r>
+          </w:p>
+        </w:tc>
+        <w:tc>
+          <w:tcPr/>
+          <w:p>
+            <w:pPr>
+              <w:pStyle w:val="Compact"/>
+              <w:jc w:val="left"/>
+            </w:pPr>
+            <w:r>
+              <w:t xml:space="preserve">Fetch unread emails from Gmail</w:t>
+            </w:r>
+          </w:p>
+        </w:tc>
+        <w:tc>
+          <w:tcPr/>
+          <w:p>
+            <w:pPr>
+              <w:pStyle w:val="Compact"/>
+              <w:jc w:val="left"/>
+            </w:pPr>
+            <w:r>
+              <w:t xml:space="preserve">Emails are successfully retrieved from the inbox.</w:t>
+            </w:r>
+          </w:p>
+        </w:tc>
+      </w:tr>
+      <w:tr>
+        <w:tc>
+          <w:tcPr/>
+          <w:p>
+            <w:pPr>
+              <w:pStyle w:val="Compact"/>
+              <w:jc w:val="left"/>
+            </w:pPr>
+            <w:r>
+              <w:t xml:space="preserve">TC_002</w:t>
+            </w:r>
+          </w:p>
+        </w:tc>
+        <w:tc>
+          <w:tcPr/>
+          <w:p>
+            <w:pPr>
+              <w:pStyle w:val="Compact"/>
+              <w:jc w:val="left"/>
+            </w:pPr>
+            <w:r>
+              <w:t xml:space="preserve">Process email content with Groovy script</w:t>
+            </w:r>
+          </w:p>
+        </w:tc>
+        <w:tc>
+          <w:tcPr/>
+          <w:p>
+            <w:pPr>
+              <w:pStyle w:val="Compact"/>
+              <w:jc w:val="left"/>
+            </w:pPr>
+            <w:r>
+              <w:t xml:space="preserve">Content is transformed as expected without errors.</w:t>
+            </w:r>
+          </w:p>
+        </w:tc>
+      </w:tr>
+      <w:tr>
+        <w:tc>
+          <w:tcPr/>
+          <w:p>
+            <w:pPr>
+              <w:pStyle w:val="Compact"/>
+              <w:jc w:val="left"/>
+            </w:pPr>
+            <w:r>
+              <w:t xml:space="preserve">TC_003</w:t>
+            </w:r>
+          </w:p>
+        </w:tc>
+        <w:tc>
+          <w:tcPr/>
+          <w:p>
+            <w:pPr>
+              <w:pStyle w:val="Compact"/>
+              <w:jc w:val="left"/>
+            </w:pPr>
+            <w:r>
+              <w:t xml:space="preserve">Send processed email to recipient</w:t>
+            </w:r>
+          </w:p>
+        </w:tc>
+        <w:tc>
+          <w:tcPr/>
+          <w:p>
+            <w:pPr>
+              <w:pStyle w:val="Compact"/>
+              <w:jc w:val="left"/>
+            </w:pPr>
+            <w:r>
+              <w:t xml:space="preserve">Email is sent successfully to the specified recipient.</w:t>
+            </w:r>
+          </w:p>
+        </w:tc>
+      </w:tr>
+      <w:tr>
+        <w:tc>
+          <w:tcPr/>
+          <w:p>
+            <w:pPr>
+              <w:pStyle w:val="Compact"/>
+              <w:jc w:val="left"/>
+            </w:pPr>
+            <w:r>
+              <w:t xml:space="preserve">TC_004</w:t>
+            </w:r>
+          </w:p>
+        </w:tc>
+        <w:tc>
+          <w:tcPr/>
+          <w:p>
+            <w:pPr>
+              <w:pStyle w:val="Compact"/>
+              <w:jc w:val="left"/>
+            </w:pPr>
+            <w:r>
+              <w:t xml:space="preserve">Handle error during email fetch</w:t>
+            </w:r>
+          </w:p>
+        </w:tc>
+        <w:tc>
+          <w:tcPr/>
+          <w:p>
+            <w:pPr>
+              <w:pStyle w:val="Compact"/>
+              <w:jc w:val="left"/>
+            </w:pPr>
+            <w:r>
+              <w:t xml:space="preserve">Error is logged, and no exception is returned to the sender.</w:t>
+            </w:r>
+          </w:p>
+        </w:tc>
+      </w:tr>
+    </w:tbl>
+    <w:bookmarkEnd w:id="31"/>
+    <w:bookmarkStart w:id="32" w:name="reference-documents"/>
+    <w:p>
+      <w:pPr>
+        <w:pStyle w:val="Heading1"/>
+      </w:pPr>
+      <w:r>
+        <w:t xml:space="preserve">6. Reference Documents</w:t>
       </w:r>
     </w:p>
     <w:p>
@@ -402,39 +738,10 @@
           <w:ilvl w:val="0"/>
           <w:numId w:val="1007"/>
         </w:numPr>
+        <w:pStyle w:val="Compact"/>
       </w:pPr>
       <w:r>
-        <w:t xml:space="preserve">Testing Validation</w:t>
-      </w:r>
-      <w:r>
-        <w:t xml:space="preserve"> </w:t>
-      </w:r>
-      <w:r>
-        <w:t xml:space="preserve">| Test Case ID | Scenario | Expected Outcome |</w:t>
-      </w:r>
-      <w:r>
-        <w:t xml:space="preserve"> </w:t>
-      </w:r>
-      <w:r>
-        <w:t xml:space="preserve">|—————|———————————–|—————————————————|</w:t>
-      </w:r>
-      <w:r>
-        <w:t xml:space="preserve"> </w:t>
-      </w:r>
-      <w:r>
-        <w:t xml:space="preserve">| TC_01 | Fetch unread emails | Unread emails are successfully retrieved from Gmail. |</w:t>
-      </w:r>
-      <w:r>
-        <w:t xml:space="preserve"> </w:t>
-      </w:r>
-      <w:r>
-        <w:t xml:space="preserve">| TC_02 | Process email content | Email content is processed and transformed correctly. |</w:t>
-      </w:r>
-      <w:r>
-        <w:t xml:space="preserve"> </w:t>
-      </w:r>
-      <w:r>
-        <w:t xml:space="preserve">| TC_03 | Send email with attachment | Email is sent successfully to the specified recipient with the correct attachment. |</w:t>
+        <w:t xml:space="preserve">SAP CPI Documentation</w:t>
       </w:r>
     </w:p>
     <w:p>
@@ -443,47 +750,25 @@
           <w:ilvl w:val="0"/>
           <w:numId w:val="1007"/>
         </w:numPr>
+        <w:pStyle w:val="Compact"/>
       </w:pPr>
       <w:r>
-        <w:t xml:space="preserve">Reference Documents</w:t>
+        <w:t xml:space="preserve">IMAP and SMTP Protocol Specifications</w:t>
       </w:r>
     </w:p>
     <w:p>
       <w:pPr>
         <w:numPr>
           <w:ilvl w:val="0"/>
-          <w:numId w:val="1008"/>
+          <w:numId w:val="1007"/>
         </w:numPr>
         <w:pStyle w:val="Compact"/>
       </w:pPr>
       <w:r>
-        <w:t xml:space="preserve">CPI Package: integrationflow</w:t>
+        <w:t xml:space="preserve">Groovy Scripting Guide for SAP CPI</w:t>
       </w:r>
     </w:p>
-    <w:p>
-      <w:pPr>
-        <w:numPr>
-          <w:ilvl w:val="0"/>
-          <w:numId w:val="1008"/>
-        </w:numPr>
-        <w:pStyle w:val="Compact"/>
-      </w:pPr>
-      <w:r>
-        <w:t xml:space="preserve">iFlow Name: integrationflow</w:t>
-      </w:r>
-    </w:p>
-    <w:p>
-      <w:pPr>
-        <w:numPr>
-          <w:ilvl w:val="0"/>
-          <w:numId w:val="1008"/>
-        </w:numPr>
-        <w:pStyle w:val="Compact"/>
-      </w:pPr>
-      <w:r>
-        <w:t xml:space="preserve">Related References: IMAP and SMTP adapter documentation, Groovy script documentation.</w:t>
-      </w:r>
-    </w:p>
+    <w:bookmarkEnd w:id="32"/>
     <w:sectPr>
       <w:headerReference r:id="rId9" w:type="default"/>
       <w:pgSz w:h="15840" w:w="12240"/>
@@ -963,261 +1248,6 @@
       </w:pPr>
     </w:lvl>
   </w:abstractNum>
-  <w:abstractNum w:abstractNumId="99412">
-    <w:nsid w:val="A99412"/>
-    <w:multiLevelType w:val="multilevel"/>
-    <w:lvl w:ilvl="0">
-      <w:start w:val="2"/>
-      <w:numFmt w:val="decimal"/>
-      <w:lvlText w:val="%1."/>
-      <w:lvlJc w:val="left"/>
-      <w:pPr>
-        <w:ind w:left="720" w:hanging="480"/>
-      </w:pPr>
-    </w:lvl>
-    <w:lvl w:ilvl="1">
-      <w:start w:val="2"/>
-      <w:numFmt w:val="decimal"/>
-      <w:lvlText w:val="%2."/>
-      <w:lvlJc w:val="left"/>
-      <w:pPr>
-        <w:ind w:left="1440" w:hanging="480"/>
-      </w:pPr>
-    </w:lvl>
-    <w:lvl w:ilvl="2">
-      <w:start w:val="2"/>
-      <w:numFmt w:val="decimal"/>
-      <w:lvlText w:val="%3."/>
-      <w:lvlJc w:val="left"/>
-      <w:pPr>
-        <w:ind w:left="2160" w:hanging="480"/>
-      </w:pPr>
-    </w:lvl>
-    <w:lvl w:ilvl="3">
-      <w:start w:val="2"/>
-      <w:numFmt w:val="decimal"/>
-      <w:lvlText w:val="%4."/>
-      <w:lvlJc w:val="left"/>
-      <w:pPr>
-        <w:ind w:left="2880" w:hanging="480"/>
-      </w:pPr>
-    </w:lvl>
-    <w:lvl w:ilvl="4">
-      <w:start w:val="2"/>
-      <w:numFmt w:val="decimal"/>
-      <w:lvlText w:val="%5."/>
-      <w:lvlJc w:val="left"/>
-      <w:pPr>
-        <w:ind w:left="3600" w:hanging="480"/>
-      </w:pPr>
-    </w:lvl>
-    <w:lvl w:ilvl="5">
-      <w:start w:val="2"/>
-      <w:numFmt w:val="decimal"/>
-      <w:lvlText w:val="%6."/>
-      <w:lvlJc w:val="left"/>
-      <w:pPr>
-        <w:ind w:left="4320" w:hanging="480"/>
-      </w:pPr>
-    </w:lvl>
-    <w:lvl w:ilvl="6">
-      <w:start w:val="2"/>
-      <w:numFmt w:val="decimal"/>
-      <w:lvlText w:val="%7."/>
-      <w:lvlJc w:val="left"/>
-      <w:pPr>
-        <w:ind w:left="5040" w:hanging="480"/>
-      </w:pPr>
-    </w:lvl>
-    <w:lvl w:ilvl="7">
-      <w:start w:val="2"/>
-      <w:numFmt w:val="decimal"/>
-      <w:lvlText w:val="%8."/>
-      <w:lvlJc w:val="left"/>
-      <w:pPr>
-        <w:ind w:left="5760" w:hanging="480"/>
-      </w:pPr>
-    </w:lvl>
-    <w:lvl w:ilvl="8">
-      <w:start w:val="2"/>
-      <w:numFmt w:val="decimal"/>
-      <w:lvlText w:val="%9."/>
-      <w:lvlJc w:val="left"/>
-      <w:pPr>
-        <w:ind w:left="6480" w:hanging="480"/>
-      </w:pPr>
-    </w:lvl>
-  </w:abstractNum>
-  <w:abstractNum w:abstractNumId="99413">
-    <w:nsid w:val="A99413"/>
-    <w:multiLevelType w:val="multilevel"/>
-    <w:lvl w:ilvl="0">
-      <w:start w:val="3"/>
-      <w:numFmt w:val="decimal"/>
-      <w:lvlText w:val="%1."/>
-      <w:lvlJc w:val="left"/>
-      <w:pPr>
-        <w:ind w:left="720" w:hanging="480"/>
-      </w:pPr>
-    </w:lvl>
-    <w:lvl w:ilvl="1">
-      <w:start w:val="3"/>
-      <w:numFmt w:val="decimal"/>
-      <w:lvlText w:val="%2."/>
-      <w:lvlJc w:val="left"/>
-      <w:pPr>
-        <w:ind w:left="1440" w:hanging="480"/>
-      </w:pPr>
-    </w:lvl>
-    <w:lvl w:ilvl="2">
-      <w:start w:val="3"/>
-      <w:numFmt w:val="decimal"/>
-      <w:lvlText w:val="%3."/>
-      <w:lvlJc w:val="left"/>
-      <w:pPr>
-        <w:ind w:left="2160" w:hanging="480"/>
-      </w:pPr>
-    </w:lvl>
-    <w:lvl w:ilvl="3">
-      <w:start w:val="3"/>
-      <w:numFmt w:val="decimal"/>
-      <w:lvlText w:val="%4."/>
-      <w:lvlJc w:val="left"/>
-      <w:pPr>
-        <w:ind w:left="2880" w:hanging="480"/>
-      </w:pPr>
-    </w:lvl>
-    <w:lvl w:ilvl="4">
-      <w:start w:val="3"/>
-      <w:numFmt w:val="decimal"/>
-      <w:lvlText w:val="%5."/>
-      <w:lvlJc w:val="left"/>
-      <w:pPr>
-        <w:ind w:left="3600" w:hanging="480"/>
-      </w:pPr>
-    </w:lvl>
-    <w:lvl w:ilvl="5">
-      <w:start w:val="3"/>
-      <w:numFmt w:val="decimal"/>
-      <w:lvlText w:val="%6."/>
-      <w:lvlJc w:val="left"/>
-      <w:pPr>
-        <w:ind w:left="4320" w:hanging="480"/>
-      </w:pPr>
-    </w:lvl>
-    <w:lvl w:ilvl="6">
-      <w:start w:val="3"/>
-      <w:numFmt w:val="decimal"/>
-      <w:lvlText w:val="%7."/>
-      <w:lvlJc w:val="left"/>
-      <w:pPr>
-        <w:ind w:left="5040" w:hanging="480"/>
-      </w:pPr>
-    </w:lvl>
-    <w:lvl w:ilvl="7">
-      <w:start w:val="3"/>
-      <w:numFmt w:val="decimal"/>
-      <w:lvlText w:val="%8."/>
-      <w:lvlJc w:val="left"/>
-      <w:pPr>
-        <w:ind w:left="5760" w:hanging="480"/>
-      </w:pPr>
-    </w:lvl>
-    <w:lvl w:ilvl="8">
-      <w:start w:val="3"/>
-      <w:numFmt w:val="decimal"/>
-      <w:lvlText w:val="%9."/>
-      <w:lvlJc w:val="left"/>
-      <w:pPr>
-        <w:ind w:left="6480" w:hanging="480"/>
-      </w:pPr>
-    </w:lvl>
-  </w:abstractNum>
-  <w:abstractNum w:abstractNumId="99414">
-    <w:nsid w:val="A99414"/>
-    <w:multiLevelType w:val="multilevel"/>
-    <w:lvl w:ilvl="0">
-      <w:start w:val="4"/>
-      <w:numFmt w:val="decimal"/>
-      <w:lvlText w:val="%1."/>
-      <w:lvlJc w:val="left"/>
-      <w:pPr>
-        <w:ind w:left="720" w:hanging="480"/>
-      </w:pPr>
-    </w:lvl>
-    <w:lvl w:ilvl="1">
-      <w:start w:val="4"/>
-      <w:numFmt w:val="decimal"/>
-      <w:lvlText w:val="%2."/>
-      <w:lvlJc w:val="left"/>
-      <w:pPr>
-        <w:ind w:left="1440" w:hanging="480"/>
-      </w:pPr>
-    </w:lvl>
-    <w:lvl w:ilvl="2">
-      <w:start w:val="4"/>
-      <w:numFmt w:val="decimal"/>
-      <w:lvlText w:val="%3."/>
-      <w:lvlJc w:val="left"/>
-      <w:pPr>
-        <w:ind w:left="2160" w:hanging="480"/>
-      </w:pPr>
-    </w:lvl>
-    <w:lvl w:ilvl="3">
-      <w:start w:val="4"/>
-      <w:numFmt w:val="decimal"/>
-      <w:lvlText w:val="%4."/>
-      <w:lvlJc w:val="left"/>
-      <w:pPr>
-        <w:ind w:left="2880" w:hanging="480"/>
-      </w:pPr>
-    </w:lvl>
-    <w:lvl w:ilvl="4">
-      <w:start w:val="4"/>
-      <w:numFmt w:val="decimal"/>
-      <w:lvlText w:val="%5."/>
-      <w:lvlJc w:val="left"/>
-      <w:pPr>
-        <w:ind w:left="3600" w:hanging="480"/>
-      </w:pPr>
-    </w:lvl>
-    <w:lvl w:ilvl="5">
-      <w:start w:val="4"/>
-      <w:numFmt w:val="decimal"/>
-      <w:lvlText w:val="%6."/>
-      <w:lvlJc w:val="left"/>
-      <w:pPr>
-        <w:ind w:left="4320" w:hanging="480"/>
-      </w:pPr>
-    </w:lvl>
-    <w:lvl w:ilvl="6">
-      <w:start w:val="4"/>
-      <w:numFmt w:val="decimal"/>
-      <w:lvlText w:val="%7."/>
-      <w:lvlJc w:val="left"/>
-      <w:pPr>
-        <w:ind w:left="5040" w:hanging="480"/>
-      </w:pPr>
-    </w:lvl>
-    <w:lvl w:ilvl="7">
-      <w:start w:val="4"/>
-      <w:numFmt w:val="decimal"/>
-      <w:lvlText w:val="%8."/>
-      <w:lvlJc w:val="left"/>
-      <w:pPr>
-        <w:ind w:left="5760" w:hanging="480"/>
-      </w:pPr>
-    </w:lvl>
-    <w:lvl w:ilvl="8">
-      <w:start w:val="4"/>
-      <w:numFmt w:val="decimal"/>
-      <w:lvlText w:val="%9."/>
-      <w:lvlJc w:val="left"/>
-      <w:pPr>
-        <w:ind w:left="6480" w:hanging="480"/>
-      </w:pPr>
-    </w:lvl>
-  </w:abstractNum>
   <w:abstractNum w:abstractNumId="991">
     <w:nsid w:val="A991"/>
     <w:multiLevelType w:val="multilevel"/>
@@ -1288,91 +1318,6 @@
     <w:lvl w:ilvl="8">
       <w:numFmt w:val="bullet"/>
       <w:lvlText w:val="•"/>
-      <w:lvlJc w:val="left"/>
-      <w:pPr>
-        <w:ind w:left="6480" w:hanging="480"/>
-      </w:pPr>
-    </w:lvl>
-  </w:abstractNum>
-  <w:abstractNum w:abstractNumId="99415">
-    <w:nsid w:val="A99415"/>
-    <w:multiLevelType w:val="multilevel"/>
-    <w:lvl w:ilvl="0">
-      <w:start w:val="5"/>
-      <w:numFmt w:val="decimal"/>
-      <w:lvlText w:val="%1."/>
-      <w:lvlJc w:val="left"/>
-      <w:pPr>
-        <w:ind w:left="720" w:hanging="480"/>
-      </w:pPr>
-    </w:lvl>
-    <w:lvl w:ilvl="1">
-      <w:start w:val="5"/>
-      <w:numFmt w:val="decimal"/>
-      <w:lvlText w:val="%2."/>
-      <w:lvlJc w:val="left"/>
-      <w:pPr>
-        <w:ind w:left="1440" w:hanging="480"/>
-      </w:pPr>
-    </w:lvl>
-    <w:lvl w:ilvl="2">
-      <w:start w:val="5"/>
-      <w:numFmt w:val="decimal"/>
-      <w:lvlText w:val="%3."/>
-      <w:lvlJc w:val="left"/>
-      <w:pPr>
-        <w:ind w:left="2160" w:hanging="480"/>
-      </w:pPr>
-    </w:lvl>
-    <w:lvl w:ilvl="3">
-      <w:start w:val="5"/>
-      <w:numFmt w:val="decimal"/>
-      <w:lvlText w:val="%4."/>
-      <w:lvlJc w:val="left"/>
-      <w:pPr>
-        <w:ind w:left="2880" w:hanging="480"/>
-      </w:pPr>
-    </w:lvl>
-    <w:lvl w:ilvl="4">
-      <w:start w:val="5"/>
-      <w:numFmt w:val="decimal"/>
-      <w:lvlText w:val="%5."/>
-      <w:lvlJc w:val="left"/>
-      <w:pPr>
-        <w:ind w:left="3600" w:hanging="480"/>
-      </w:pPr>
-    </w:lvl>
-    <w:lvl w:ilvl="5">
-      <w:start w:val="5"/>
-      <w:numFmt w:val="decimal"/>
-      <w:lvlText w:val="%6."/>
-      <w:lvlJc w:val="left"/>
-      <w:pPr>
-        <w:ind w:left="4320" w:hanging="480"/>
-      </w:pPr>
-    </w:lvl>
-    <w:lvl w:ilvl="6">
-      <w:start w:val="5"/>
-      <w:numFmt w:val="decimal"/>
-      <w:lvlText w:val="%7."/>
-      <w:lvlJc w:val="left"/>
-      <w:pPr>
-        <w:ind w:left="5040" w:hanging="480"/>
-      </w:pPr>
-    </w:lvl>
-    <w:lvl w:ilvl="7">
-      <w:start w:val="5"/>
-      <w:numFmt w:val="decimal"/>
-      <w:lvlText w:val="%8."/>
-      <w:lvlJc w:val="left"/>
-      <w:pPr>
-        <w:ind w:left="5760" w:hanging="480"/>
-      </w:pPr>
-    </w:lvl>
-    <w:lvl w:ilvl="8">
-      <w:start w:val="5"/>
-      <w:numFmt w:val="decimal"/>
-      <w:lvlText w:val="%9."/>
       <w:lvlJc w:val="left"/>
       <w:pPr>
         <w:ind w:left="6480" w:hanging="480"/>
@@ -1440,6 +1385,9 @@
     </w:lvlOverride>
   </w:num>
   <w:num w:numId="1002">
+    <w:abstractNumId w:val="991"/>
+  </w:num>
+  <w:num w:numId="1003">
     <w:abstractNumId w:val="99411"/>
     <w:lvlOverride w:ilvl="0">
       <w:startOverride w:val="1"/>
@@ -1469,130 +1417,16 @@
       <w:startOverride w:val="1"/>
     </w:lvlOverride>
   </w:num>
-  <w:num w:numId="1003">
-    <w:abstractNumId w:val="99412"/>
-    <w:lvlOverride w:ilvl="0">
-      <w:startOverride w:val="2"/>
-    </w:lvlOverride>
-    <w:lvlOverride w:ilvl="1">
-      <w:startOverride w:val="2"/>
-    </w:lvlOverride>
-    <w:lvlOverride w:ilvl="2">
-      <w:startOverride w:val="2"/>
-    </w:lvlOverride>
-    <w:lvlOverride w:ilvl="3">
-      <w:startOverride w:val="2"/>
-    </w:lvlOverride>
-    <w:lvlOverride w:ilvl="4">
-      <w:startOverride w:val="2"/>
-    </w:lvlOverride>
-    <w:lvlOverride w:ilvl="5">
-      <w:startOverride w:val="2"/>
-    </w:lvlOverride>
-    <w:lvlOverride w:ilvl="6">
-      <w:startOverride w:val="2"/>
-    </w:lvlOverride>
-    <w:lvlOverride w:ilvl="7">
-      <w:startOverride w:val="2"/>
-    </w:lvlOverride>
-    <w:lvlOverride w:ilvl="8">
-      <w:startOverride w:val="2"/>
-    </w:lvlOverride>
-  </w:num>
   <w:num w:numId="1004">
-    <w:abstractNumId w:val="99413"/>
-    <w:lvlOverride w:ilvl="0">
-      <w:startOverride w:val="3"/>
-    </w:lvlOverride>
-    <w:lvlOverride w:ilvl="1">
-      <w:startOverride w:val="3"/>
-    </w:lvlOverride>
-    <w:lvlOverride w:ilvl="2">
-      <w:startOverride w:val="3"/>
-    </w:lvlOverride>
-    <w:lvlOverride w:ilvl="3">
-      <w:startOverride w:val="3"/>
-    </w:lvlOverride>
-    <w:lvlOverride w:ilvl="4">
-      <w:startOverride w:val="3"/>
-    </w:lvlOverride>
-    <w:lvlOverride w:ilvl="5">
-      <w:startOverride w:val="3"/>
-    </w:lvlOverride>
-    <w:lvlOverride w:ilvl="6">
-      <w:startOverride w:val="3"/>
-    </w:lvlOverride>
-    <w:lvlOverride w:ilvl="7">
-      <w:startOverride w:val="3"/>
-    </w:lvlOverride>
-    <w:lvlOverride w:ilvl="8">
-      <w:startOverride w:val="3"/>
-    </w:lvlOverride>
+    <w:abstractNumId w:val="991"/>
   </w:num>
   <w:num w:numId="1005">
-    <w:abstractNumId w:val="99414"/>
-    <w:lvlOverride w:ilvl="0">
-      <w:startOverride w:val="4"/>
-    </w:lvlOverride>
-    <w:lvlOverride w:ilvl="1">
-      <w:startOverride w:val="4"/>
-    </w:lvlOverride>
-    <w:lvlOverride w:ilvl="2">
-      <w:startOverride w:val="4"/>
-    </w:lvlOverride>
-    <w:lvlOverride w:ilvl="3">
-      <w:startOverride w:val="4"/>
-    </w:lvlOverride>
-    <w:lvlOverride w:ilvl="4">
-      <w:startOverride w:val="4"/>
-    </w:lvlOverride>
-    <w:lvlOverride w:ilvl="5">
-      <w:startOverride w:val="4"/>
-    </w:lvlOverride>
-    <w:lvlOverride w:ilvl="6">
-      <w:startOverride w:val="4"/>
-    </w:lvlOverride>
-    <w:lvlOverride w:ilvl="7">
-      <w:startOverride w:val="4"/>
-    </w:lvlOverride>
-    <w:lvlOverride w:ilvl="8">
-      <w:startOverride w:val="4"/>
-    </w:lvlOverride>
+    <w:abstractNumId w:val="991"/>
   </w:num>
   <w:num w:numId="1006">
     <w:abstractNumId w:val="991"/>
   </w:num>
   <w:num w:numId="1007">
-    <w:abstractNumId w:val="99415"/>
-    <w:lvlOverride w:ilvl="0">
-      <w:startOverride w:val="5"/>
-    </w:lvlOverride>
-    <w:lvlOverride w:ilvl="1">
-      <w:startOverride w:val="5"/>
-    </w:lvlOverride>
-    <w:lvlOverride w:ilvl="2">
-      <w:startOverride w:val="5"/>
-    </w:lvlOverride>
-    <w:lvlOverride w:ilvl="3">
-      <w:startOverride w:val="5"/>
-    </w:lvlOverride>
-    <w:lvlOverride w:ilvl="4">
-      <w:startOverride w:val="5"/>
-    </w:lvlOverride>
-    <w:lvlOverride w:ilvl="5">
-      <w:startOverride w:val="5"/>
-    </w:lvlOverride>
-    <w:lvlOverride w:ilvl="6">
-      <w:startOverride w:val="5"/>
-    </w:lvlOverride>
-    <w:lvlOverride w:ilvl="7">
-      <w:startOverride w:val="5"/>
-    </w:lvlOverride>
-    <w:lvlOverride w:ilvl="8">
-      <w:startOverride w:val="5"/>
-    </w:lvlOverride>
-  </w:num>
-  <w:num w:numId="1008">
     <w:abstractNumId w:val="991"/>
   </w:num>
 </w:numbering>

</xml_diff>